<commit_message>
Sync beachhead strategy docx with shipped AI Business Advisor behaviour.
Capture Chuk identity, Claude-first routing, Pricing/Enrolment Advisors, impact ledger, and section 40 product reality so the vision doc matches the live codebase.
</commit_message>
<xml_diff>
--- a/AI_Business_Intelligence_SaaS_Product_Vision_and_Roadmap_Beachhead_Strategy.docx
+++ b/AI_Business_Intelligence_SaaS_Product_Vision_and_Roadmap_Beachhead_Strategy.docx
@@ -50,7 +50,7 @@
           <w:color w:val="2D7D7A"/>
           <w:sz w:val="28"/>
         </w:rPr>
-        <w:t>Working Product Name: TBD</w:t>
+        <w:t>Working Product Name: AI Business Advisor (AI advisor persona: Chuk)</w:t>
       </w:r>
     </w:p>
     <w:p>
@@ -70,7 +70,7 @@
         <w:rPr>
           <w:color w:val="5B6670"/>
         </w:rPr>
-        <w:t>Prepared August 2026</w:t>
+        <w:t>Prepared August 2026 · Updated 16 August 2026</w:t>
       </w:r>
     </w:p>
     <w:p>
@@ -78,7 +78,12 @@
         <w:rPr>
           <w:b/>
         </w:rPr>
-        <w:t>Revision: Beachhead-Market Strategy, After-School-First Commercial Focus, Industry-Aware Future Architecture, Privacy-First AI Learning and Benchmarking</w:t>
+        <w:t>Revision: Beachhead-Market Strategy, After-School-First Commercial Focus, Industry-Aware Future Architecture, Privacy-First AI Learning and Benchmarking, Shipped Beachhead Product Reality (Chuk, Pricing Advisor, Enrolment Advisor, Impact Ledger, Claude-first routing, legal/landing/R2)</w:t>
+      </w:r>
+    </w:p>
+    <w:p>
+      <w:r>
+        <w:t>Document purpose: This document deliberately preserves the complete long-term product vision while separating it from the launch strategy. The architecture should remain capable of supporting many industries, but the commercial product should begin with a deliberately small beachhead market: independent after-school, tutoring and enrichment education centres. Near-term scope is governed by one rule: future capability may shape architecture, but it must not automatically become a near-term feature. The product earns the right to expand only after it creates repeatable, measurable value in the first niche. Companion implementation source of truth for shipped behaviour: BUSINESS_ADVISOR_PROJECT_SPECIFICATION.md in the business-advisor repository. Section 40 below summarizes how the live product works as of 16 August 2026.</w:t>
       </w:r>
     </w:p>
     <w:tbl>
@@ -429,6 +434,21 @@
       </w:pPr>
       <w:r>
         <w:t>37. Technical Reference Notes</w:t>
+      </w:r>
+    </w:p>
+    <w:p>
+      <w:r>
+        <w:t>38. Advice Impact Ledger (Shipped)</w:t>
+      </w:r>
+    </w:p>
+    <w:p>
+      <w:r>
+        <w:t>39. Pricing Advisor and Enrolment Advisor (Shipped)</w:t>
+      </w:r>
+    </w:p>
+    <w:p>
+      <w:r>
+        <w:t>40. How the Product Works Today (Shipped Beachhead Reality)</w:t>
       </w:r>
     </w:p>
     <w:p>
@@ -8052,7 +8072,7 @@
     </w:p>
     <w:p>
       <w:r>
-        <w:t>The AI Advisor is a base product capability, not an optional add-on. Every paying plan should include conversational access and automatic insight generation. Higher plans can include more usage, deeper reasoning, more frequent analysis and advanced tools.</w:t>
+        <w:t>The AI Advisor (user-facing name: Chuk) is a base product capability, not an optional add-on. Every paying plan should include conversational access and automatic insight generation. Higher plans can include more usage, deeper reasoning, more frequent analysis and advanced tools. In the shipped product, Chuk calls deterministic analytics tools only; it does not invent metrics.</w:t>
       </w:r>
     </w:p>
     <w:p>
@@ -8660,7 +8680,7 @@
     </w:p>
     <w:p>
       <w:r>
-        <w:t>The product should not be hard-wired to one AI provider. Build a provider interface and policy-driven router. OpenAI can be the primary provider initially, while another production provider can be configured as fallback. Provider fallback is not perfect because capabilities and tool formats differ, so the application should use standardized internal tool schemas and provider-specific adapters.</w:t>
+        <w:t>The product should not be hard-wired to one AI provider. Build a provider interface and policy-driven router. Production routing prefers Anthropic Claude first, with OpenAI as fallback, then a local deterministic fallback that restates tool verdicts without inventing numbers. Provider fallback is not perfect because capabilities and tool formats differ, so the application uses standardized internal tool schemas and provider-specific adapters.</w:t>
       </w:r>
     </w:p>
     <w:tbl>
@@ -12139,7 +12159,7 @@
           </w:tcPr>
           <w:p>
             <w:r>
-              <w:t>Build only the commercial shell needed to run a real SaaS pilot</w:t>
+              <w:t>Build only the commercial shell needed to run a real SaaS pilot [SHIPPED in codebase as of August 2026]</w:t>
             </w:r>
           </w:p>
         </w:tc>
@@ -12149,7 +12169,7 @@
           </w:tcPr>
           <w:p>
             <w:r>
-              <w:t>Multi-tenancy, auth/RBAC, organizations, Stripe Billing, Stripe Connect foundation, audit trail, a small canonical contract, connector interface and privacy-aware AI-provider abstraction. Build extension points, not a marketplace.</w:t>
+              <w:t>[SHIPPED] Multi-tenancy, auth/RBAC, organizations, Stripe Billing, Stripe Connect foundation, audit trail, a small canonical contract, connector interface and privacy-aware AI-provider abstraction. Build extension points, not a marketplace.</w:t>
             </w:r>
           </w:p>
         </w:tc>
@@ -12174,7 +12194,7 @@
           </w:tcPr>
           <w:p>
             <w:r>
-              <w:t>Solve the founder/customer #1 problem immediately</w:t>
+              <w:t>Solve the founder/customer #1 problem immediately [Core MVP SHIPPED; deepen through continuous use]</w:t>
             </w:r>
           </w:p>
         </w:tc>
@@ -12184,7 +12204,7 @@
           </w:tcPr>
           <w:p>
             <w:r>
-              <w:t>After-school setup, secure academy connector, manual expenses/subscriptions/loans, staff/wage assumptions, targets, enrolment/trial/capacity analytics, simple forecasting, basic cash outlook, deterministic insights, AI Advisor, weekly brief and $5/month live billing. Success means useful decisions or savings, not feature count.</w:t>
+              <w:t>[SHIPPED core] After-school setup, secure academy connector, manual expenses/subscriptions/loans, staff/wage assumptions, targets, enrolment/trial/capacity analytics, simple forecasting, basic cash outlook, deterministic insights, AI Advisor, weekly brief and $5/month live billing. Success means useful decisions or savings, not feature count.</w:t>
             </w:r>
           </w:p>
         </w:tc>
@@ -12209,7 +12229,7 @@
           </w:tcPr>
           <w:p>
             <w:r>
-              <w:t>Turn the pilot into measurable operating savings</w:t>
+              <w:t>Turn the pilot into measurable operating savings [Largely SHIPPED: Data Readiness, expense/subscription registry, labour-vs-demand, verified impact ledger]</w:t>
             </w:r>
           </w:p>
         </w:tc>
@@ -12244,7 +12264,7 @@
           </w:tcPr>
           <w:p>
             <w:r>
-              <w:t>Make the first vertical exceptionally good before broad sales</w:t>
+              <w:t>Make the first vertical exceptionally good before broad sales [PARTIAL: Action Centre, Pricing/Enrolment Advisors, education playbooks shipped; attendance depth and richer forecasts continue]</w:t>
             </w:r>
           </w:p>
         </w:tc>
@@ -14207,7 +14227,7 @@
         <w:spacing w:after="60"/>
       </w:pPr>
       <w:r>
-        <w:t>Realized-savings ledger</w:t>
+        <w:t>Realized-savings ledger (shipped as Advice Impact Ledger — see §38)</w:t>
       </w:r>
     </w:p>
     <w:p>
@@ -14243,7 +14263,7 @@
         <w:spacing w:after="60"/>
       </w:pPr>
       <w:r>
-        <w:t>Pricing and discount simulator</w:t>
+        <w:t>Pricing and discount simulator (Pricing Advisor cost-floor / target-margin / price-test verdicts shipped — see §39; richer simulators remain long-term)</w:t>
       </w:r>
     </w:p>
     <w:p>
@@ -16477,7 +16497,7 @@
         <w:pStyle w:val="Heading1"/>
       </w:pPr>
       <w:r>
-        <w:t>35. Advice Impact Ledger (Shipped 14 August 2026)</w:t>
+        <w:t>38. Advice Impact Ledger (Shipped 14 August 2026)</w:t>
       </w:r>
     </w:p>
     <w:p>
@@ -16539,6 +16559,485 @@
       <w:pPr>
         <w:spacing w:after="20"/>
       </w:pPr>
+    </w:p>
+    <w:p>
+      <w:pPr>
+        <w:pStyle w:val="Heading1"/>
+      </w:pPr>
+      <w:r>
+        <w:t>39. Pricing Advisor and Enrolment Advisor (Shipped 14 August 2026)</w:t>
+      </w:r>
+    </w:p>
+    <w:p>
+      <w:r>
+        <w:t>Two specialized advisors shipped inside Phase 1 / early Phase 2 depth. Both are deterministic services; Chuk only phrases their evidence. They feed the Action Centre and the impact ledger.</w:t>
+      </w:r>
+    </w:p>
+    <w:p>
+      <w:pPr>
+        <w:pStyle w:val="Heading2"/>
+      </w:pPr>
+      <w:r>
+        <w:t>Pricing Advisor</w:t>
+      </w:r>
+    </w:p>
+    <w:p>
+      <w:pPr>
+        <w:pStyle w:val="ListBullet"/>
+      </w:pPr>
+      <w:r>
+        <w:t>Per-programme cost floor (cheapest the centre can afford) and recommended price at the organization's configurable target margin (default 30%).</w:t>
+      </w:r>
+    </w:p>
+    <w:p>
+      <w:pPr>
+        <w:pStyle w:val="ListBullet"/>
+      </w:pPr>
+      <w:r>
+        <w:t>Floor combines weekly session labour (× 4.345 ÷ active enrolments) with shared monthly expenses and subscriptions allocated across active students. Salaried wages are expressed hourly at 2,080 hours/year.</w:t>
+      </w:r>
+    </w:p>
+    <w:p>
+      <w:pPr>
+        <w:pStyle w:val="ListBullet"/>
+      </w:pPr>
+      <w:r>
+        <w:t>Hard no-guessing gate: numbers appear only when price, active enrolments, next-7-day sessions with end times and instructors, wage profiles for those instructors, and at least one expense/subscription record all exist. Otherwise the verdict is INSUFFICIENT_DATA with a concrete missingData ask list — that ask is the advice.</w:t>
+      </w:r>
+    </w:p>
+    <w:p>
+      <w:pPr>
+        <w:pStyle w:val="ListBullet"/>
+      </w:pPr>
+      <w:r>
+        <w:t>Verdicts: Below Cost; Below Target Margin; On Track; Above Target: Price Test. The price-test verdict requires list price clearly above recommended (≥15% and ≥$10), utilization under 60% now and 28 days ago, spare seats, and a weak demand signal (trial-to-paid, enquiry-to-enrol, or enrolment velocity vs prior 28 days with minimum samples).</w:t>
+      </w:r>
+    </w:p>
+    <w:p>
+      <w:pPr>
+        <w:pStyle w:val="ListBullet"/>
+      </w:pPr>
+      <w:r>
+        <w:t>Advice is a time-boxed 6-week test at the recommended price (still above the cost floor) or limited promo/scholarship seats — never “price caused empty seats” and never “cut to $X and you will fill.” Empty seats alone keep On Track. Household income, census, and area-affordability figures are out of scope.</w:t>
+      </w:r>
+    </w:p>
+    <w:p>
+      <w:pPr>
+        <w:pStyle w:val="ListBullet"/>
+      </w:pPr>
+      <w:r>
+        <w:t>Surfaces: /app/pricing, GET /api/app/pricing/guidance, pricingGuidance AI tool, insight-run recommendations, inline weekly-session form (POST /api/app/sessions). Session evidence returned to the UI strips per-instructor hourly rates and burden percents; Chuk still sees full evidence server-side.</w:t>
+      </w:r>
+    </w:p>
+    <w:p>
+      <w:pPr>
+        <w:pStyle w:val="Heading2"/>
+      </w:pPr>
+      <w:r>
+        <w:t>Enrolment Advisor</w:t>
+      </w:r>
+    </w:p>
+    <w:p>
+      <w:pPr>
+        <w:pStyle w:val="ListBullet"/>
+      </w:pPr>
+      <w:r>
+        <w:t>Diagnoses the named leak from records: Needs Data, Full Room, Conversion Leak, Retention Leak, Enrolment Velocity Down, Spare Seats, On Track.</w:t>
+      </w:r>
+    </w:p>
+    <w:p>
+      <w:pPr>
+        <w:pStyle w:val="ListBullet"/>
+      </w:pPr>
+      <w:r>
+        <w:t>Cheap next steps first; a time-boxed paid test only when conversion is healthy, spare seats exist, and cash/runway can absorb it (cash-safe weekly paid-test cap from unit-economics tools).</w:t>
+      </w:r>
+    </w:p>
+    <w:p>
+      <w:pPr>
+        <w:pStyle w:val="ListBullet"/>
+      </w:pPr>
+      <w:r>
+        <w:t>Owner logs what they tried and the result (enrolment_tactics_tried). Notes stay organization-private.</w:t>
+      </w:r>
+    </w:p>
+    <w:p>
+      <w:pPr>
+        <w:pStyle w:val="ListBullet"/>
+      </w:pPr>
+      <w:r>
+        <w:t>De-identified share checkbox appears only when a leak is named and the outcome is not UNKNOWN. Opt-in writes anonymized_tactic_outcomes with purposeVersion somtico_models_v1 (no org id, no free text). Opted-in rows may later train or evaluate Somtico-owned models; they are never sent to train third-party providers.</w:t>
+      </w:r>
+    </w:p>
+    <w:p>
+      <w:pPr>
+        <w:pStyle w:val="ListBullet"/>
+      </w:pPr>
+      <w:r>
+        <w:t>Peer playbook ranking: when 8+ similar opted-in reports exist, patterns sort by helped share and reorder the tactic catalogue.</w:t>
+      </w:r>
+    </w:p>
+    <w:p>
+      <w:pPr>
+        <w:pStyle w:val="ListBullet"/>
+      </w:pPr>
+      <w:r>
+        <w:t>Surfaces: /app/enrolment, GET /api/app/enrolment/guidance, tactic POST/DELETE, enrolmentGuidance AI tool, insight-run recommendations. Ask Chuk must ask for tried-and-results when that log is empty and must not invent student counts or ROI.</w:t>
+      </w:r>
+    </w:p>
+    <w:p>
+      <w:pPr>
+        <w:pStyle w:val="Heading1"/>
+      </w:pPr>
+      <w:r>
+        <w:t>40. How the Product Works Today (Shipped Beachhead Reality — 16 August 2026)</w:t>
+      </w:r>
+    </w:p>
+    <w:p>
+      <w:r>
+        <w:t>This section captures how the live AI Business Advisor product works in the business-advisor codebase. Long-term vision sections above remain intentional direction; they are not a claim that every listed capability is already built. Where this section and an earlier aspirational paragraph conflict, this section and BUSINESS_ADVISOR_PROJECT_SPECIFICATION.md win for shipped behaviour.</w:t>
+      </w:r>
+    </w:p>
+    <w:p>
+      <w:pPr>
+        <w:pStyle w:val="Heading2"/>
+      </w:pPr>
+      <w:r>
+        <w:t>Product identity and stack</w:t>
+      </w:r>
+    </w:p>
+    <w:p>
+      <w:pPr>
+        <w:pStyle w:val="ListBullet"/>
+      </w:pPr>
+      <w:r>
+        <w:t>Product name: AI Business Advisor. AI advisor persona: Chuk (software, not a person). Company: Somtico Technologies Inc.</w:t>
+      </w:r>
+    </w:p>
+    <w:p>
+      <w:pPr>
+        <w:pStyle w:val="ListBullet"/>
+      </w:pPr>
+      <w:r>
+        <w:t>Monorepo: Express + Prisma + PostgreSQL backend; Vite + React 19 + Tailwind frontend. Local ports: frontend 3007, backend 5007.</w:t>
+      </w:r>
+    </w:p>
+    <w:p>
+      <w:pPr>
+        <w:pStyle w:val="ListBullet"/>
+      </w:pPr>
+      <w:r>
+        <w:t>Multi-tenant from day one (organizationId scoping). Tenant resolve via subdomain of ROOT_DOMAIN (businessadvisor.app), ?slug=, or X-Tenant-Slug when ALLOW_TENANT_HEADER=true.</w:t>
+      </w:r>
+    </w:p>
+    <w:p>
+      <w:pPr>
+        <w:pStyle w:val="ListBullet"/>
+      </w:pPr>
+      <w:r>
+        <w:t>Auth: email/password + organization slug; JWT access tokens; roles OWNER, ADMIN, FINANCE, OPERATIONS, ANALYST, VIEWER. Email verification via Brevo when configured; local/dev auto-verifies without Brevo.</w:t>
+      </w:r>
+    </w:p>
+    <w:p>
+      <w:pPr>
+        <w:pStyle w:val="ListBullet"/>
+      </w:pPr>
+      <w:r>
+        <w:t>Billing: Stripe Billing for $5 CAD/month PILOT; webhooks activate the organization. Without Stripe keys, development auto-activates. Stripe Connect Express onboard/refresh foundation is present; not a full marketplace payout product.</w:t>
+      </w:r>
+    </w:p>
+    <w:p>
+      <w:pPr>
+        <w:pStyle w:val="ListBullet"/>
+      </w:pPr>
+      <w:r>
+        <w:t>AI: keyword tool routing → deterministic analytics tools → Claude preferred → OpenAI fallback → local deterministic fallback. Conversations stored; usage metered. Ask Chuk UI does not expose provider/model names.</w:t>
+      </w:r>
+    </w:p>
+    <w:p>
+      <w:pPr>
+        <w:pStyle w:val="ListBullet"/>
+      </w:pPr>
+      <w:r>
+        <w:t>Jobs: daily analysis + impact verification; Monday weekly executive brief (Brevo when configured). Cloudflare R2 daily PostgreSQL backups via GitHub Actions (see R2_BACKUP_SETUP_GUIDE.md).</w:t>
+      </w:r>
+    </w:p>
+    <w:p>
+      <w:pPr>
+        <w:pStyle w:val="ListBullet"/>
+      </w:pPr>
+      <w:r>
+        <w:t>Deploy: Railway (migrate → ensure-db-schema → generate → start).</w:t>
+      </w:r>
+    </w:p>
+    <w:p>
+      <w:pPr>
+        <w:pStyle w:val="Heading2"/>
+      </w:pPr>
+      <w:r>
+        <w:t>Primary user flows</w:t>
+      </w:r>
+    </w:p>
+    <w:p>
+      <w:pPr>
+        <w:pStyle w:val="ListBullet"/>
+      </w:pPr>
+      <w:r>
+        <w:t>Signup at /signup creates org + OWNER + entitlement + subscription shell + subdomain domain + data-readiness rows; education blueprint after_school_tutoring_enrichment is applied automatically (no industry selector). Education subtype includes STEM Academy and Other (required free text).</w:t>
+      </w:r>
+    </w:p>
+    <w:p>
+      <w:pPr>
+        <w:pStyle w:val="ListBullet"/>
+      </w:pPr>
+      <w:r>
+        <w:t>Legal: Terms of Service and Privacy Policy public pages; signup requires scroll-to-end acceptance with termsAccepted/privacyAccepted stamps and version fields. Saskatchewan governing law/venue.</w:t>
+      </w:r>
+    </w:p>
+    <w:p>
+      <w:pPr>
+        <w:pStyle w:val="ListBullet"/>
+      </w:pPr>
+      <w:r>
+        <w:t>After payment/activation and email verification, owner lands on /app/onboarding then Command Centre /app.</w:t>
+      </w:r>
+    </w:p>
+    <w:p>
+      <w:pPr>
+        <w:pStyle w:val="ListBullet"/>
+      </w:pPr>
+      <w:r>
+        <w:t>Login requires email, password, and organization slug.</w:t>
+      </w:r>
+    </w:p>
+    <w:p>
+      <w:pPr>
+        <w:pStyle w:val="Heading2"/>
+      </w:pPr>
+      <w:r>
+        <w:t>Signed-in application surfaces</w:t>
+      </w:r>
+    </w:p>
+    <w:p>
+      <w:pPr>
+        <w:pStyle w:val="ListBullet"/>
+      </w:pPr>
+      <w:r>
+        <w:t>Command Centre (/app): metrics, this week's named leak / cheap next step / last tactic / playbook counts / open actions (operating loop), Chuk's Impact card, forecasts, staffing-vs-demand.</w:t>
+      </w:r>
+    </w:p>
+    <w:p>
+      <w:pPr>
+        <w:pStyle w:val="ListBullet"/>
+      </w:pPr>
+      <w:r>
+        <w:t>Data Readiness Centre; Programmes &amp; Students (CRUD + CSV); Staffing (staff, wages, shifts); Expenses &amp; Subscriptions (expenses, recurring tools, loans); Targets &amp; Forecasts.</w:t>
+      </w:r>
+    </w:p>
+    <w:p>
+      <w:pPr>
+        <w:pStyle w:val="ListBullet"/>
+      </w:pPr>
+      <w:r>
+        <w:t>Action Centre: insights → recommendations → confirm/verify impact.</w:t>
+      </w:r>
+    </w:p>
+    <w:p>
+      <w:pPr>
+        <w:pStyle w:val="ListBullet"/>
+      </w:pPr>
+      <w:r>
+        <w:t>Pricing Advisor; Enrolment Advisor; Ask Chuk; Help &amp; FAQ; Settings (billing, Connect, portal sync, weekly brief triggers).</w:t>
+      </w:r>
+    </w:p>
+    <w:p>
+      <w:pPr>
+        <w:pStyle w:val="ListBullet"/>
+      </w:pPr>
+      <w:r>
+        <w:t>Public marketing landing at / with Meet Chuk, how-it-works, capabilities, product screenshots, visitor FAQs, Start Pilot / Sign In. Public chrome also wraps login, signup, terms, privacy, verify-email.</w:t>
+      </w:r>
+    </w:p>
+    <w:p>
+      <w:pPr>
+        <w:pStyle w:val="Heading2"/>
+      </w:pPr>
+      <w:r>
+        <w:t>Data intake</w:t>
+      </w:r>
+    </w:p>
+    <w:p>
+      <w:pPr>
+        <w:pStyle w:val="ListBullet"/>
+      </w:pPr>
+      <w:r>
+        <w:t>Manual-first CRUD for locations, programmes, students, enrolments, staff/wages, shifts, expenses, subscriptions, loans, targets, sessions.</w:t>
+      </w:r>
+    </w:p>
+    <w:p>
+      <w:pPr>
+        <w:pStyle w:val="ListBullet"/>
+      </w:pPr>
+      <w:r>
+        <w:t>CSV import for students, expenses, subscriptions, revenue.</w:t>
+      </w:r>
+    </w:p>
+    <w:p>
+      <w:pPr>
+        <w:pStyle w:val="ListBullet"/>
+      </w:pPr>
+      <w:r>
+        <w:t>Read-only STEM Lantern / Skill Samurai portal connector sync into canonical objects via ExternalIdentity (STEM_LANTERN_PORTAL_URL + API key). Portal exposes GET /api/connector/v1/snapshot; SaaS does not take permanent LIVE_DB_URL access.</w:t>
+      </w:r>
+    </w:p>
+    <w:p>
+      <w:pPr>
+        <w:pStyle w:val="Heading2"/>
+      </w:pPr>
+      <w:r>
+        <w:t>Intelligence core (deterministic first)</w:t>
+      </w:r>
+    </w:p>
+    <w:p>
+      <w:pPr>
+        <w:pStyle w:val="ListBullet"/>
+      </w:pPr>
+      <w:r>
+        <w:t>BusinessInsightService generates structured insights; Action Centre holds recommendations with impactType (SAVINGS/REVENUE), source (INSIGHT/ADVISOR_CHAT/MANUAL), expected vs verified realized impact.</w:t>
+      </w:r>
+    </w:p>
+    <w:p>
+      <w:pPr>
+        <w:pStyle w:val="ListBullet"/>
+      </w:pPr>
+      <w:r>
+        <w:t>Advice impact ledger: completing an action never auto-copies the estimate. It snapshots a measurement baseline and starts a 30-day verification window. Daily job measures delta from actuals (labour/subscription) capped at the estimate, or prompts USER_CONFIRMED confirm/adjust/zero. Rollups keep verified, estimated-pending, and pipeline strictly separate.</w:t>
+      </w:r>
+    </w:p>
+    <w:p>
+      <w:pPr>
+        <w:pStyle w:val="ListBullet"/>
+      </w:pPr>
+      <w:r>
+        <w:t>Organization memory tool: every Ask Chuk call includes this centre's last 90 days of actions, verified impact, and enrolment tactics. Chuk must not recommend repeating a tactic whose recorded outcome here was NO_EFFECT or HURT unless the owner asks.</w:t>
+      </w:r>
+    </w:p>
+    <w:p>
+      <w:pPr>
+        <w:pStyle w:val="ListBullet"/>
+      </w:pPr>
+      <w:r>
+        <w:t>Unit-economics tools: instructor cost per seat-hour, household monthly/annualized list-price value, trial-to-paid by programme, cash-safe weekly paid-test cap.</w:t>
+      </w:r>
+    </w:p>
+    <w:p>
+      <w:pPr>
+        <w:pStyle w:val="ListBullet"/>
+      </w:pPr>
+      <w:r>
+        <w:t>AI safeguards: evidence-only system prompt; never guess/extrapolate/invent; relay missingData verbatim; no legal/tax/accounting/investment advice. ADVICE_DISCLAIMER returned on every advisor answer, shown under AI/pricing surfaces, and appended to the weekly brief.</w:t>
+      </w:r>
+    </w:p>
+    <w:p>
+      <w:pPr>
+        <w:pStyle w:val="ListBullet"/>
+      </w:pPr>
+      <w:r>
+        <w:t>AnalysisProgress + SkeletonCard loading UX on Pricing Advisor, Ask Chuk, Command Centre, and Action Centre insight runs.</w:t>
+      </w:r>
+    </w:p>
+    <w:p>
+      <w:pPr>
+        <w:pStyle w:val="Heading2"/>
+      </w:pPr>
+      <w:r>
+        <w:t>What remains deferred (do not treat as shipped)</w:t>
+      </w:r>
+    </w:p>
+    <w:p>
+      <w:pPr>
+        <w:pStyle w:val="ListBullet"/>
+      </w:pPr>
+      <w:r>
+        <w:t>Restaurant / second-vertical UI; industry selector exposure.</w:t>
+      </w:r>
+    </w:p>
+    <w:p>
+      <w:pPr>
+        <w:pStyle w:val="ListBullet"/>
+      </w:pPr>
+      <w:r>
+        <w:t>Write-back agents, payroll automation, QuickBooks production connector.</w:t>
+      </w:r>
+    </w:p>
+    <w:p>
+      <w:pPr>
+        <w:pStyle w:val="ListBullet"/>
+      </w:pPr>
+      <w:r>
+        <w:t>Somtico-owned fine-tuned industry model (playbook counts and helped-share ranking ship now; fine-tune waits for volume).</w:t>
+      </w:r>
+    </w:p>
+    <w:p>
+      <w:pPr>
+        <w:pStyle w:val="ListBullet"/>
+      </w:pPr>
+      <w:r>
+        <w:t>Cross-tenant benchmarking network at scale; Fast/Standard/Deep AI mode packaging; public API/SDK marketplace.</w:t>
+      </w:r>
+    </w:p>
+    <w:p>
+      <w:pPr>
+        <w:pStyle w:val="ListBullet"/>
+      </w:pPr>
+      <w:r>
+        <w:t>PlatformAdmin product UI; refresh-token endpoint usage; hard entitlement-cap enforcement; STARTER/GROWTH plan billing beyond PILOT; full Stripe Connect marketplace.</w:t>
+      </w:r>
+    </w:p>
+    <w:p>
+      <w:pPr>
+        <w:pStyle w:val="Heading2"/>
+      </w:pPr>
+      <w:r>
+        <w:t>STEM Lantern beachhead notes</w:t>
+      </w:r>
+    </w:p>
+    <w:p>
+      <w:pPr>
+        <w:pStyle w:val="ListBullet"/>
+      </w:pPr>
+      <w:r>
+        <w:t>Customer #1: STEM Lantern Education Inc. Portal data source during rebrand: Skill Samurai Saskatoon Registration Portal.</w:t>
+      </w:r>
+    </w:p>
+    <w:p>
+      <w:pPr>
+        <w:pStyle w:val="ListBullet"/>
+      </w:pPr>
+      <w:r>
+        <w:t>CAD currency defaults; America/Regina timezone defaults; Canadian English UI copy.</w:t>
+      </w:r>
+    </w:p>
+    <w:p>
+      <w:pPr>
+        <w:pStyle w:val="ListBullet"/>
+      </w:pPr>
+      <w:r>
+        <w:t>Pilot price $5 CAD/month to exercise real subscription lifecycle, not as market pricing.</w:t>
+      </w:r>
+    </w:p>
+    <w:p>
+      <w:pPr>
+        <w:pStyle w:val="Heading1"/>
+      </w:pPr>
+      <w:r>
+        <w:t>Final Product Principle (restated)</w:t>
+      </w:r>
+    </w:p>
+    <w:p>
+      <w:r>
+        <w:t>Start with a market small enough to understand deeply and a product small enough to finish. The long-term North Star remains a multi-industry AI business operating system, but the launch product is AI Business Advisor — with Chuk as the advisor persona — for independent after-school, tutoring and enrichment centres. STEM Lantern is Customer #1; the next customers should look more like STEM Lantern, not less. Architectural foresight is valuable only when it prevents a costly dead end. It must not become an excuse to build future industries, connectors or abstractions before the first niche receives repeatable, measurable value. The product earns each expansion: first solve one owner's problem, then a handful of similar owners, then a focused market, then adjacent markets. The platform should therefore feel specialized in experience and disciplined in scope while remaining extensible underneath. Dominate depth before pursuing breadth.</w:t>
+      </w:r>
     </w:p>
     <w:sectPr>
       <w:headerReference w:type="default" r:id="rId8"/>

</xml_diff>

<commit_message>
Build proprietary intelligence flywheel foundation
Add decision/outcome lifecycle with versioned context snapshots, somtico_models_v2 privacy-safe observations, purpose-aware consent, contextual playbook ranking, benchmark-ready snapshots, source-mapping knowledge, evaluation harness, and moat health instrumentation — without replacing shipped v1 tactics, Pricing/Enrolment Advisors, or the Impact Ledger.
</commit_message>
<xml_diff>
--- a/AI_Business_Intelligence_SaaS_Product_Vision_and_Roadmap_Beachhead_Strategy.docx
+++ b/AI_Business_Intelligence_SaaS_Product_Vision_and_Roadmap_Beachhead_Strategy.docx
@@ -75,10 +75,7 @@
     </w:p>
     <w:p>
       <w:r>
-        <w:rPr>
-          <w:b/>
-        </w:rPr>
-        <w:t>Revision: Beachhead-Market Strategy, After-School-First Commercial Focus, Industry-Aware Future Architecture, Privacy-First AI Learning and Benchmarking, Shipped Beachhead Product Reality (Chuk, Pricing Advisor, Enrolment Advisor, Impact Ledger, Claude-first routing, legal/landing/R2)</w:t>
+        <w:t>Revision: Beachhead-Market Strategy, After-School-First Commercial Focus, Industry-Aware Future Architecture, Privacy-First AI Learning and Benchmarking, Proprietary Intelligence Flywheel, Contextual Decision-Outcome Learning, Benchmark-Ready Data Collection, Mapping Intelligence, Moat Health Metrics, Shipped Beachhead Product Reality (Chuk, Pricing Advisor, Enrolment Advisor, Impact Ledger, Claude-first routing, legal/landing/R2)</w:t>
       </w:r>
     </w:p>
     <w:p>
@@ -1365,6 +1362,28 @@
           <w:p>
             <w:r>
               <w:t>The first user experience is purpose-built for after-school/enrichment centres. Future industries influence interfaces and abstractions only where doing so is cheap and justified; they do not create launch scope.</w:t>
+            </w:r>
+          </w:p>
+        </w:tc>
+      </w:tr>
+      <w:tr>
+        <w:tc>
+          <w:tcPr>
+            <w:tcW w:type="dxa" w:w="4296"/>
+          </w:tcPr>
+          <w:p>
+            <w:r>
+              <w:t>Models are replaceable; intelligence compounds</w:t>
+            </w:r>
+          </w:p>
+        </w:tc>
+        <w:tc>
+          <w:tcPr>
+            <w:tcW w:type="dxa" w:w="6144"/>
+          </w:tcPr>
+          <w:p>
+            <w:r>
+              <w:t>Treat frontier AI models as interchangeable reasoning and language infrastructure. The durable product value must accumulate in Somtico-owned normalized business data, metric definitions, diagnostics, tenant memory, decision-outcome evidence, playbooks, mapping intelligence, evaluation sets and privacy-safe benchmarks.</w:t>
             </w:r>
           </w:p>
         </w:tc>
@@ -8196,6 +8215,62 @@
         <w:pStyle w:val="Heading2"/>
       </w:pPr>
       <w:r>
+        <w:t>Proprietary Intelligence Boundary</w:t>
+      </w:r>
+    </w:p>
+    <w:p>
+      <w:pPr/>
+      <w:r>
+        <w:t>The AI provider is a replaceable reasoning and language interface, not the durable source of business intelligence. Somtico should increasingly own the canonical business graph, trusted metric definitions, diagnostic services, tenant-specific operating memory, recommendation and outcome history, validated playbooks, source-mapping knowledge, evaluation datasets and privacy-safe peer intelligence. A future Claude, OpenAI, Gemini or other model should be swappable without erasing these assets.</w:t>
+      </w:r>
+    </w:p>
+    <w:p>
+      <w:pPr>
+        <w:pStyle w:val="ListBullet"/>
+      </w:pPr>
+      <w:r>
+        <w:rPr>
+          <w:b/>
+        </w:rPr>
+        <w:t xml:space="preserve">Grounding rule: </w:t>
+      </w:r>
+      <w:r>
+        <w:t>prefer Somtico deterministic tools, tenant history and validated playbooks over general model knowledge whenever those assets can answer the question.</w:t>
+      </w:r>
+    </w:p>
+    <w:p>
+      <w:pPr>
+        <w:pStyle w:val="ListBullet"/>
+      </w:pPr>
+      <w:r>
+        <w:rPr>
+          <w:b/>
+        </w:rPr>
+        <w:t xml:space="preserve">Compounding rule: </w:t>
+      </w:r>
+      <w:r>
+        <w:t>new features should be designed so that useful customer activity can improve future diagnostics, onboarding, forecasts or recommendations without exposing another tenant's identifiable data.</w:t>
+      </w:r>
+    </w:p>
+    <w:p>
+      <w:pPr>
+        <w:pStyle w:val="ListBullet"/>
+      </w:pPr>
+      <w:r>
+        <w:rPr>
+          <w:b/>
+        </w:rPr>
+        <w:t xml:space="preserve">Evaluation rule: </w:t>
+      </w:r>
+      <w:r>
+        <w:t>maintain a generic-model baseline so the full Chuk system can be tested against the same frontier model using only a generic education-business prompt. If Chuk is not increasingly more accurate, actionable and evidence-grounded, the moat is not strengthening.</w:t>
+      </w:r>
+    </w:p>
+    <w:p>
+      <w:pPr>
+        <w:pStyle w:val="Heading2"/>
+      </w:pPr>
+      <w:r>
         <w:lastRenderedPageBreak/>
         <w:t>Industry-Aware Advisor and Knowledge Packs</w:t>
       </w:r>
@@ -12280,6 +12355,41 @@
         </w:tc>
       </w:tr>
       <w:tr>
+        <w:tc>
+          <w:tcPr>
+            <w:tcW w:type="dxa" w:w="2631"/>
+            <w:vAlign w:val="top"/>
+          </w:tcPr>
+          <w:p>
+            <w:r>
+              <w:t>2.5 - Proprietary Intelligence Flywheel Foundation</w:t>
+            </w:r>
+          </w:p>
+        </w:tc>
+        <w:tc>
+          <w:tcPr>
+            <w:tcW w:type="dxa" w:w="2811"/>
+            <w:vAlign w:val="top"/>
+          </w:tcPr>
+          <w:p>
+            <w:r>
+              <w:t>Ensure every useful recommendation can create a compounding product asset before the design-partner cohort scales</w:t>
+            </w:r>
+          </w:p>
+        </w:tc>
+        <w:tc>
+          <w:tcPr>
+            <w:tcW w:type="dxa" w:w="4998"/>
+            <w:vAlign w:val="top"/>
+          </w:tcPr>
+          <w:p>
+            <w:r>
+              <w:t>Create a versioned structured lifecycle for diagnosis -&gt; evidence -&gt; recommendation -&gt; owner decision -&gt; action -&gt; outcome -&gt; learning. Capture a privacy-safe context snapshot at recommendation time, define intervention/outcome taxonomies, build a benchmark-ready opt-in snapshot pipeline that collects early but publishes nothing until privacy thresholds are met, create reusable source-schema/mapping intelligence, and establish a generic-model baseline evaluation harness. This phase is infrastructure for learning, not a promise of autonomous ML.</w:t>
+            </w:r>
+          </w:p>
+        </w:tc>
+      </w:tr>
+      <w:tr>
         <w:trPr>
           <w:jc w:val="center"/>
         </w:trPr>
@@ -12309,11 +12419,7 @@
           </w:tcPr>
           <w:p>
             <w:r>
-              <w:t xml:space="preserve">Onboard 3-5 independent after-school/tutoring/enrichment centres using their real systems/data. Improve </w:t>
-            </w:r>
-            <w:r>
-              <w:lastRenderedPageBreak/>
-              <w:t>mapping/imports, terminology, onboarding, support, data-quality handling and advisor usefulness without customer-specific forks.</w:t>
+              <w:t>Onboard 3-5 independent after-school/tutoring/enrichment centres using their real systems/data. Improve mapping/imports, terminology, onboarding, support, data-quality handling and advisor usefulness without customer-specific forks. With explicit opt-in, begin accumulating benchmark-ready coarse metric snapshots and context-rich recommendation/outcome records. Reuse and review source-field mappings across customers so onboarding becomes faster without exposing one tenant's raw data to another. Do not publish peer comparisons yet unless privacy-safe cohort thresholds are satisfied.</w:t>
             </w:r>
           </w:p>
         </w:tc>
@@ -12349,7 +12455,7 @@
           </w:tcPr>
           <w:p>
             <w:r>
-              <w:t>QuickBooks Online pilot, Wave-supported data/imports, Stripe payment data, P&amp;L/cash-flow normalization, accounting reconciliation, provider capability matrix and finance-source provenance. Keep manual fallback first-class.</w:t>
+              <w:t>QuickBooks Online pilot, Wave-supported data/imports, Stripe payment data, P&amp;L/cash-flow normalization, accounting reconciliation, provider capability matrix and finance-source provenance. Keep manual fallback first-class. Extend the decision-outcome context to trusted financial variables and record whether recommendations change margin, cash pressure, recurring spend or collection outcomes where measurable.</w:t>
             </w:r>
           </w:p>
         </w:tc>
@@ -12384,7 +12490,7 @@
           </w:tcPr>
           <w:p>
             <w:r>
-              <w:t>Time/payroll/scheduling integrations, attendance, labour forecasting, CRM/lead sources, email/ads where justified, CAC/LTV, campaign-to-capacity recommendations, and reusable connector tooling driven by actual education-customer demand.</w:t>
+              <w:t>Time/payroll/scheduling integrations, attendance, labour forecasting, CRM/lead sources, email/ads where justified, CAC/LTV, campaign-to-capacity recommendations, and reusable connector tooling driven by actual education-customer demand. Turn repeated connector and CSV mapping patterns into a reviewed mapping-knowledge library. Enrich intervention records with relevant context such as utilization, conversion, retention, capacity and cash constraints so the system learns what works under which conditions, not merely which tactic was popular.</w:t>
             </w:r>
           </w:p>
         </w:tc>
@@ -12419,7 +12525,7 @@
           </w:tcPr>
           <w:p>
             <w:r>
-              <w:t>Expand from Saskatchewan relationships to Canadian independent education centres; build case studies, referrals, repeatable onboarding, pricing, support playbooks and peer benchmarks only when privacy-safe cohort size exists.</w:t>
+              <w:t>Expand from Saskatchewan relationships to Canadian independent education centres; build case studies, referrals, repeatable onboarding, pricing, support playbooks and peer benchmarks only when privacy-safe cohort size exists. When cohort size and consent permit, launch privacy-safe peer benchmarks and contextual playbook ranking. Demonstrate that onboarding time, mapping reuse, recommendation quality and forecast accuracy improve as the education network grows.</w:t>
             </w:r>
           </w:p>
         </w:tc>
@@ -12524,7 +12630,7 @@
           </w:tcPr>
           <w:p>
             <w:r>
-              <w:t>Versioned industry blueprints, template research/review workflow, opt-in anonymized peer benchmarks, industry percentile scorecards, privacy-safe template-improvement pipeline and optional hybrid-business modules.</w:t>
+              <w:t>Versioned industry blueprints, template research/review workflow, opt-in anonymized peer benchmarks, industry percentile scorecards, privacy-safe template-improvement pipeline and optional hybrid-business modules. Preserve vertical-specific outcome taxonomies and benchmark cohorts rather than pooling unrelated businesses into misleading averages. Promote cross-vertical concepts only after human review and evidence that the abstraction is genuinely reusable.</w:t>
             </w:r>
           </w:p>
         </w:tc>
@@ -12560,7 +12666,7 @@
           </w:tcPr>
           <w:p>
             <w:r>
-              <w:t>Forecast ensembles, anomaly models, advanced scenario lab, model evaluation/router optimization, richer domain knowledge, natural-language dashboard building and deeper strategic reviews.</w:t>
+              <w:t>Forecast ensembles, anomaly models, advanced scenario lab, model evaluation/router optimization, richer domain knowledge, natural-language dashboard building and deeper strategic reviews. Train, fine-tune or distil Somtico-owned models only when proprietary outcome/evaluation data is sufficiently large and clean. The dataset and evaluation system are the moat; the model is a replaceable implementation choice.</w:t>
             </w:r>
           </w:p>
         </w:tc>
@@ -13871,6 +13977,48 @@
     </w:p>
     <w:p>
       <w:pPr>
+        <w:pStyle w:val="ListBullet"/>
+      </w:pPr>
+      <w:r>
+        <w:rPr>
+          <w:b/>
+        </w:rPr>
+        <w:t xml:space="preserve">Moat instrumentation: </w:t>
+      </w:r>
+      <w:r>
+        <w:t>the product records enough structured context, decisions and outcomes to measure whether proprietary intelligence is accumulating rather than merely generating more AI text.</w:t>
+      </w:r>
+    </w:p>
+    <w:p>
+      <w:pPr>
+        <w:pStyle w:val="ListBullet"/>
+      </w:pPr>
+      <w:r>
+        <w:rPr>
+          <w:b/>
+        </w:rPr>
+        <w:t xml:space="preserve">Baseline differentiation: </w:t>
+      </w:r>
+      <w:r>
+        <w:t>a repeatable evaluation harness shows the complete Chuk system is materially more factual, evidence-grounded or actionable than the same frontier model given only a generic after-school-business prompt on representative owner questions.</w:t>
+      </w:r>
+    </w:p>
+    <w:p>
+      <w:pPr>
+        <w:pStyle w:val="ListBullet"/>
+      </w:pPr>
+      <w:r>
+        <w:rPr>
+          <w:b/>
+        </w:rPr>
+        <w:t xml:space="preserve">Privacy-safe learning readiness: </w:t>
+      </w:r>
+      <w:r>
+        <w:t>the opt-in outcome/benchmark pipeline has been exercised with design partners and can remove or coarsen identifying information, enforce cohort thresholds and honour opt-out/deletion requirements before any peer insight is shown.</w:t>
+      </w:r>
+    </w:p>
+    <w:p>
+      <w:pPr>
         <w:pStyle w:val="Heading1"/>
       </w:pPr>
       <w:r>
@@ -14059,6 +14207,735 @@
     </w:p>
     <w:p>
       <w:pPr>
+        <w:pStyle w:val="Heading2"/>
+      </w:pPr>
+      <w:r>
+        <w:t>Moat Thesis</w:t>
+      </w:r>
+    </w:p>
+    <w:p>
+      <w:pPr/>
+      <w:r>
+        <w:t>A competitor can reproduce a dashboard, connect the same Claude/OpenAI/Gemini model and imitate an advisor persona. The defensible product is the proprietary intelligence system underneath the interface: normalized longitudinal business data, trusted calculations, vertical diagnoses, tenant-specific operating memory, structured intervention outcomes, reusable mappings, privacy-safe peer evidence and evaluation history. Each additional customer should make at least one of those assets better.</w:t>
+      </w:r>
+    </w:p>
+    <w:tbl>
+      <w:tblPr>
+        <w:tblStyle w:val="TableGrid"/>
+        <w:tblW w:type="auto" w:w="0"/>
+        <w:jc w:val="center"/>
+        <w:tblLook w:firstColumn="1" w:firstRow="1" w:lastColumn="0" w:lastRow="0" w:noHBand="0" w:noVBand="1" w:val="04A0"/>
+      </w:tblPr>
+      <w:tblGrid>
+        <w:gridCol w:w="3408"/>
+        <w:gridCol w:w="3408"/>
+        <w:gridCol w:w="3408"/>
+      </w:tblGrid>
+      <w:tr>
+        <w:tc>
+          <w:tcPr>
+            <w:tcW w:type="dxa" w:w="1656"/>
+            <w:vAlign w:val="center"/>
+            <w:shd w:fill="17365D"/>
+          </w:tcPr>
+          <w:p>
+            <w:r>
+              <w:rPr>
+                <w:b/>
+                <w:color w:val="FFFFFF"/>
+              </w:rPr>
+              <w:t>Layer</w:t>
+            </w:r>
+          </w:p>
+        </w:tc>
+        <w:tc>
+          <w:tcPr>
+            <w:tcW w:type="dxa" w:w="5976"/>
+            <w:vAlign w:val="center"/>
+            <w:shd w:fill="17365D"/>
+          </w:tcPr>
+          <w:p>
+            <w:r>
+              <w:rPr>
+                <w:b/>
+                <w:color w:val="FFFFFF"/>
+              </w:rPr>
+              <w:t>What It Contains</w:t>
+            </w:r>
+          </w:p>
+        </w:tc>
+        <w:tc>
+          <w:tcPr>
+            <w:tcW w:type="dxa" w:w="2088"/>
+            <w:vAlign w:val="center"/>
+            <w:shd w:fill="17365D"/>
+          </w:tcPr>
+          <w:p>
+            <w:r>
+              <w:rPr>
+                <w:b/>
+                <w:color w:val="FFFFFF"/>
+              </w:rPr>
+              <w:t>Defensibility</w:t>
+            </w:r>
+          </w:p>
+        </w:tc>
+      </w:tr>
+      <w:tr>
+        <w:tc>
+          <w:tcPr>
+            <w:tcW w:type="dxa" w:w="1656"/>
+            <w:vAlign w:val="top"/>
+          </w:tcPr>
+          <w:p>
+            <w:r>
+              <w:t>1 - Interface</w:t>
+            </w:r>
+          </w:p>
+        </w:tc>
+        <w:tc>
+          <w:tcPr>
+            <w:tcW w:type="dxa" w:w="5976"/>
+            <w:vAlign w:val="top"/>
+          </w:tcPr>
+          <w:p>
+            <w:r>
+              <w:t>Dashboard, chat, branding, model integration</w:t>
+            </w:r>
+          </w:p>
+        </w:tc>
+        <w:tc>
+          <w:tcPr>
+            <w:tcW w:type="dxa" w:w="2088"/>
+            <w:vAlign w:val="top"/>
+          </w:tcPr>
+          <w:p>
+            <w:r>
+              <w:t>Easy to copy</w:t>
+            </w:r>
+          </w:p>
+        </w:tc>
+      </w:tr>
+      <w:tr>
+        <w:tc>
+          <w:tcPr>
+            <w:tcW w:type="dxa" w:w="1656"/>
+            <w:vAlign w:val="top"/>
+          </w:tcPr>
+          <w:p>
+            <w:r>
+              <w:t>2 - Vertical product depth</w:t>
+            </w:r>
+          </w:p>
+        </w:tc>
+        <w:tc>
+          <w:tcPr>
+            <w:tcW w:type="dxa" w:w="5976"/>
+            <w:vAlign w:val="top"/>
+          </w:tcPr>
+          <w:p>
+            <w:r>
+              <w:t>Education-specific workflows, KPIs, formulas, Pricing/Enrolment Advisors</w:t>
+            </w:r>
+          </w:p>
+        </w:tc>
+        <w:tc>
+          <w:tcPr>
+            <w:tcW w:type="dxa" w:w="2088"/>
+            <w:vAlign w:val="top"/>
+          </w:tcPr>
+          <w:p>
+            <w:r>
+              <w:t>Moderately difficult</w:t>
+            </w:r>
+          </w:p>
+        </w:tc>
+      </w:tr>
+      <w:tr>
+        <w:tc>
+          <w:tcPr>
+            <w:tcW w:type="dxa" w:w="1656"/>
+            <w:vAlign w:val="top"/>
+          </w:tcPr>
+          <w:p>
+            <w:r>
+              <w:t>3 - Longitudinal business graph</w:t>
+            </w:r>
+          </w:p>
+        </w:tc>
+        <w:tc>
+          <w:tcPr>
+            <w:tcW w:type="dxa" w:w="5976"/>
+            <w:vAlign w:val="top"/>
+          </w:tcPr>
+          <w:p>
+            <w:r>
+              <w:t>Clean historical relationships among enrolment, revenue, labour, capacity, expenses, marketing and goals</w:t>
+            </w:r>
+          </w:p>
+        </w:tc>
+        <w:tc>
+          <w:tcPr>
+            <w:tcW w:type="dxa" w:w="2088"/>
+            <w:vAlign w:val="top"/>
+          </w:tcPr>
+          <w:p>
+            <w:r>
+              <w:t>Hard</w:t>
+            </w:r>
+          </w:p>
+        </w:tc>
+      </w:tr>
+      <w:tr>
+        <w:tc>
+          <w:tcPr>
+            <w:tcW w:type="dxa" w:w="1656"/>
+            <w:vAlign w:val="top"/>
+          </w:tcPr>
+          <w:p>
+            <w:r>
+              <w:t>4 - Decision and outcome memory</w:t>
+            </w:r>
+          </w:p>
+        </w:tc>
+        <w:tc>
+          <w:tcPr>
+            <w:tcW w:type="dxa" w:w="5976"/>
+            <w:vAlign w:val="top"/>
+          </w:tcPr>
+          <w:p>
+            <w:r>
+              <w:t>What the centre tried, what Chuk recommended, what was accepted/rejected and what happened afterwards</w:t>
+            </w:r>
+          </w:p>
+        </w:tc>
+        <w:tc>
+          <w:tcPr>
+            <w:tcW w:type="dxa" w:w="2088"/>
+            <w:vAlign w:val="top"/>
+          </w:tcPr>
+          <w:p>
+            <w:r>
+              <w:t>Very hard</w:t>
+            </w:r>
+          </w:p>
+        </w:tc>
+      </w:tr>
+      <w:tr>
+        <w:tc>
+          <w:tcPr>
+            <w:tcW w:type="dxa" w:w="1656"/>
+            <w:vAlign w:val="top"/>
+          </w:tcPr>
+          <w:p>
+            <w:r>
+              <w:t>5 - Contextual peer intelligence</w:t>
+            </w:r>
+          </w:p>
+        </w:tc>
+        <w:tc>
+          <w:tcPr>
+            <w:tcW w:type="dxa" w:w="5976"/>
+            <w:vAlign w:val="top"/>
+          </w:tcPr>
+          <w:p>
+            <w:r>
+              <w:t>Privacy-safe evidence about which interventions work for which centre profiles and operating conditions</w:t>
+            </w:r>
+          </w:p>
+        </w:tc>
+        <w:tc>
+          <w:tcPr>
+            <w:tcW w:type="dxa" w:w="2088"/>
+            <w:vAlign w:val="top"/>
+          </w:tcPr>
+          <w:p>
+            <w:r>
+              <w:t>Extremely hard</w:t>
+            </w:r>
+          </w:p>
+        </w:tc>
+      </w:tr>
+      <w:tr>
+        <w:tc>
+          <w:tcPr>
+            <w:tcW w:type="dxa" w:w="1656"/>
+            <w:vAlign w:val="top"/>
+          </w:tcPr>
+          <w:p>
+            <w:r>
+              <w:t>6 - Network effect</w:t>
+            </w:r>
+          </w:p>
+        </w:tc>
+        <w:tc>
+          <w:tcPr>
+            <w:tcW w:type="dxa" w:w="5976"/>
+            <w:vAlign w:val="top"/>
+          </w:tcPr>
+          <w:p>
+            <w:r>
+              <w:t>More participating centres improve playbooks, benchmarks, mappings, onboarding and evaluation for later centres</w:t>
+            </w:r>
+          </w:p>
+        </w:tc>
+        <w:tc>
+          <w:tcPr>
+            <w:tcW w:type="dxa" w:w="2088"/>
+            <w:vAlign w:val="top"/>
+          </w:tcPr>
+          <w:p>
+            <w:r>
+              <w:t>Compounding moat</w:t>
+            </w:r>
+          </w:p>
+        </w:tc>
+      </w:tr>
+    </w:tbl>
+    <w:p>
+      <w:pPr>
+        <w:pStyle w:val="Heading2"/>
+      </w:pPr>
+      <w:r>
+        <w:t>Proprietary Intelligence Flywheel</w:t>
+      </w:r>
+    </w:p>
+    <w:p>
+      <w:pPr/>
+      <w:r>
+        <w:t>The roadmap should deliberately create the following closed loop: more education centres -&gt; more normalized operating histories -&gt; more diagnosed situations -&gt; more recommendations -&gt; more owner decisions and actions -&gt; more measured or confirmed outcomes -&gt; better contextual playbooks, forecasts and prioritization -&gt; higher customer ROI -&gt; stronger retention and referrals -&gt; more education centres. Cross-tenant learning must use explicit consent and privacy-safe representations; tenant-private data remains private.</w:t>
+      </w:r>
+    </w:p>
+    <w:p>
+      <w:pPr>
+        <w:pStyle w:val="ListBullet"/>
+      </w:pPr>
+      <w:r>
+        <w:rPr>
+          <w:b/>
+        </w:rPr>
+        <w:t xml:space="preserve">Capture at decision time: </w:t>
+      </w:r>
+      <w:r>
+        <w:t>record the evidence and relevant business context that existed when a recommendation was generated so later outcome analysis does not rely on reconstructed guesses.</w:t>
+      </w:r>
+    </w:p>
+    <w:p>
+      <w:pPr>
+        <w:pStyle w:val="ListBullet"/>
+      </w:pPr>
+      <w:r>
+        <w:rPr>
+          <w:b/>
+        </w:rPr>
+        <w:t xml:space="preserve">Separate estimate from truth: </w:t>
+      </w:r>
+      <w:r>
+        <w:t>preserve the current Impact Ledger principle that expected value is never silently converted into realized value.</w:t>
+      </w:r>
+    </w:p>
+    <w:p>
+      <w:pPr>
+        <w:pStyle w:val="ListBullet"/>
+      </w:pPr>
+      <w:r>
+        <w:rPr>
+          <w:b/>
+        </w:rPr>
+        <w:t xml:space="preserve">Learn from zero and negative outcomes: </w:t>
+      </w:r>
+      <w:r>
+        <w:t>NO_EFFECT, HURT, rejected and abandoned recommendations are useful evidence and must not be discarded merely because they make performance metrics look worse.</w:t>
+      </w:r>
+    </w:p>
+    <w:p>
+      <w:pPr>
+        <w:pStyle w:val="ListBullet"/>
+      </w:pPr>
+      <w:r>
+        <w:rPr>
+          <w:b/>
+        </w:rPr>
+        <w:t xml:space="preserve">Version everything: </w:t>
+      </w:r>
+      <w:r>
+        <w:t>diagnostic definitions, tactic taxonomy, context schema, model/router version, metric formula and outcome horizon should be versioned so historical evidence remains interpretable after the product evolves.</w:t>
+      </w:r>
+    </w:p>
+    <w:p>
+      <w:pPr>
+        <w:pStyle w:val="Heading2"/>
+      </w:pPr>
+      <w:r>
+        <w:t>Decision-Outcome Dataset: Core Proprietary Asset</w:t>
+      </w:r>
+    </w:p>
+    <w:p>
+      <w:pPr/>
+      <w:r>
+        <w:t>Over time, the highest-value proprietary dataset should describe context + diagnosis + intervention + decision + outcome, not merely prompts and responses. For each eligible recommendation, store a structured record that can be analysed without needing the original chat text.</w:t>
+      </w:r>
+    </w:p>
+    <w:p>
+      <w:pPr>
+        <w:pStyle w:val="ListBullet"/>
+      </w:pPr>
+      <w:r>
+        <w:rPr>
+          <w:b/>
+        </w:rPr>
+        <w:t xml:space="preserve">Context: </w:t>
+      </w:r>
+      <w:r>
+        <w:t>business subtype, programme/service category, size band, location count, relevant utilization/conversion/retention/capacity/cash/margin bands, season or period, data freshness and other features that materially affected the decision.</w:t>
+      </w:r>
+    </w:p>
+    <w:p>
+      <w:pPr>
+        <w:pStyle w:val="ListBullet"/>
+      </w:pPr>
+      <w:r>
+        <w:rPr>
+          <w:b/>
+        </w:rPr>
+        <w:t xml:space="preserve">Diagnosis: </w:t>
+      </w:r>
+      <w:r>
+        <w:t>the named operational problem, rule/model that detected it, confidence, supporting metric IDs and missing-data limitations.</w:t>
+      </w:r>
+    </w:p>
+    <w:p>
+      <w:pPr>
+        <w:pStyle w:val="ListBullet"/>
+      </w:pPr>
+      <w:r>
+        <w:rPr>
+          <w:b/>
+        </w:rPr>
+        <w:t xml:space="preserve">Intervention: </w:t>
+      </w:r>
+      <w:r>
+        <w:t>the recommended tactic/action category, expected mechanism, estimated cost/effort, expected impact, time horizon and required approval.</w:t>
+      </w:r>
+    </w:p>
+    <w:p>
+      <w:pPr>
+        <w:pStyle w:val="ListBullet"/>
+      </w:pPr>
+      <w:r>
+        <w:rPr>
+          <w:b/>
+        </w:rPr>
+        <w:t xml:space="preserve">Decision: </w:t>
+      </w:r>
+      <w:r>
+        <w:t>accepted, rejected, deferred, modified or not acted upon, plus tenant-private reason where available.</w:t>
+      </w:r>
+    </w:p>
+    <w:p>
+      <w:pPr>
+        <w:pStyle w:val="ListBullet"/>
+      </w:pPr>
+      <w:r>
+        <w:rPr>
+          <w:b/>
+        </w:rPr>
+        <w:t xml:space="preserve">Outcome: </w:t>
+      </w:r>
+      <w:r>
+        <w:t>measured, owner-confirmed, zero/no-effect, hurt, unknown or still pending; capture the measurement horizon and confidence.</w:t>
+      </w:r>
+    </w:p>
+    <w:p>
+      <w:pPr>
+        <w:pStyle w:val="ListBullet"/>
+      </w:pPr>
+      <w:r>
+        <w:rPr>
+          <w:b/>
+        </w:rPr>
+        <w:t xml:space="preserve">Learning eligibility: </w:t>
+      </w:r>
+      <w:r>
+        <w:t>whether the record is tenant-only or explicitly eligible for privacy-safe aggregate learning/benchmarking under the current consent purpose/version.</w:t>
+      </w:r>
+    </w:p>
+    <w:p>
+      <w:pPr>
+        <w:pStyle w:val="Heading2"/>
+      </w:pPr>
+      <w:r>
+        <w:t>Contextual Learning: What Works, For Whom, Under What Conditions</w:t>
+      </w:r>
+    </w:p>
+    <w:p>
+      <w:pPr/>
+      <w:r>
+        <w:t>A global helped-rate is not sufficient. The system should eventually rank playbooks conditionally: which intervention tends to work for centres with comparable operating conditions, and when it should not be recommended. For example, a second-trial tactic may be appropriate for a centre with healthy attendance, spare capacity and weak conversion, but inappropriate for a centre already at capacity or with a retention problem.</w:t>
+      </w:r>
+    </w:p>
+    <w:p>
+      <w:pPr>
+        <w:pStyle w:val="ListBullet"/>
+      </w:pPr>
+      <w:r>
+        <w:rPr>
+          <w:b/>
+        </w:rPr>
+        <w:t xml:space="preserve">Start with transparent rules: </w:t>
+      </w:r>
+      <w:r>
+        <w:t>use coarse bands and minimum sample thresholds before attempting complex causal or machine-learning claims.</w:t>
+      </w:r>
+    </w:p>
+    <w:p>
+      <w:pPr>
+        <w:pStyle w:val="ListBullet"/>
+      </w:pPr>
+      <w:r>
+        <w:rPr>
+          <w:b/>
+        </w:rPr>
+        <w:t xml:space="preserve">Avoid false causality: </w:t>
+      </w:r>
+      <w:r>
+        <w:t>outcome records show association with an action unless the product has a credible experimental or causal design. Phrase recommendations accordingly.</w:t>
+      </w:r>
+    </w:p>
+    <w:p>
+      <w:pPr>
+        <w:pStyle w:val="ListBullet"/>
+      </w:pPr>
+      <w:r>
+        <w:rPr>
+          <w:b/>
+        </w:rPr>
+        <w:t xml:space="preserve">Prefer comparable cohorts: </w:t>
+      </w:r>
+      <w:r>
+        <w:t>match by relevant business subtype, size, programme, maturity and operating conditions; broaden or suppress when a cohort is too small.</w:t>
+      </w:r>
+    </w:p>
+    <w:p>
+      <w:pPr>
+        <w:pStyle w:val="Heading2"/>
+      </w:pPr>
+      <w:r>
+        <w:t>Mapping Intelligence and Onboarding Moat</w:t>
+      </w:r>
+    </w:p>
+    <w:p>
+      <w:pPr/>
+      <w:r>
+        <w:t>Every source-system integration and CSV import should improve a reviewed mapping-knowledge library. The product should learn recurring schema fingerprints, field names, status codes, date conventions and transformations so later customers using the same or similar systems require less manual mapping. This knowledge must contain schema/mapping patterns, not another tenant's raw records.</w:t>
+      </w:r>
+    </w:p>
+    <w:p>
+      <w:pPr>
+        <w:pStyle w:val="ListBullet"/>
+      </w:pPr>
+      <w:r>
+        <w:rPr>
+          <w:b/>
+        </w:rPr>
+        <w:t xml:space="preserve">Mapping proposal: </w:t>
+      </w:r>
+      <w:r>
+        <w:t>when a familiar source schema is detected, propose canonical mappings with confidence and examples for human confirmation rather than silently importing ambiguous fields.</w:t>
+      </w:r>
+    </w:p>
+    <w:p>
+      <w:pPr>
+        <w:pStyle w:val="ListBullet"/>
+      </w:pPr>
+      <w:r>
+        <w:rPr>
+          <w:b/>
+        </w:rPr>
+        <w:t xml:space="preserve">Reusable transformation rules: </w:t>
+      </w:r>
+      <w:r>
+        <w:t>retain reviewed transformations such as status normalization, date parsing and programme/category mapping where they are genuinely source-specific and reusable.</w:t>
+      </w:r>
+    </w:p>
+    <w:p>
+      <w:pPr>
+        <w:pStyle w:val="ListBullet"/>
+      </w:pPr>
+      <w:r>
+        <w:rPr>
+          <w:b/>
+        </w:rPr>
+        <w:t xml:space="preserve">Measure compounding value: </w:t>
+      </w:r>
+      <w:r>
+        <w:t>track mapping reuse rate, auto-suggest accuracy, manual corrections and median onboarding time by source system.</w:t>
+      </w:r>
+    </w:p>
+    <w:p>
+      <w:pPr>
+        <w:pStyle w:val="Heading2"/>
+      </w:pPr>
+      <w:r>
+        <w:t>Benchmark-Ready Data: Collect Early, Publish Late</w:t>
+      </w:r>
+    </w:p>
+    <w:p>
+      <w:pPr/>
+      <w:r>
+        <w:t>Customer-facing peer benchmarks should wait for safe sample sizes, but the architecture should become benchmark-ready during the design-partner phase. With explicit opt-in, create privacy-safe, coarse, versioned metric snapshots early so the company does not reach market scale and discover that years of historical data are incomparable. No benchmark should be shown until minimum cohort, suppression and geographic-broadening rules are satisfied.</w:t>
+      </w:r>
+    </w:p>
+    <w:p>
+      <w:pPr>
+        <w:pStyle w:val="ListBullet"/>
+      </w:pPr>
+      <w:r>
+        <w:rPr>
+          <w:b/>
+        </w:rPr>
+        <w:t xml:space="preserve">Potential benchmark dimensions: </w:t>
+      </w:r>
+      <w:r>
+        <w:t>education subtype, approximate active-enrolment band, programme category, location-count band, maturity band, geography at a privacy-safe level and period/season.</w:t>
+      </w:r>
+    </w:p>
+    <w:p>
+      <w:pPr>
+        <w:pStyle w:val="ListBullet"/>
+      </w:pPr>
+      <w:r>
+        <w:rPr>
+          <w:b/>
+        </w:rPr>
+        <w:t xml:space="preserve">Potential benchmark metrics: </w:t>
+      </w:r>
+      <w:r>
+        <w:t>utilization, trial conversion, retention/churn, enrolment velocity, labour ratio, revenue per active learner, programme contribution margin, attendance and other metrics only where definitions reconcile across tenants.</w:t>
+      </w:r>
+    </w:p>
+    <w:p>
+      <w:pPr>
+        <w:pStyle w:val="ListBullet"/>
+      </w:pPr>
+      <w:r>
+        <w:rPr>
+          <w:b/>
+        </w:rPr>
+        <w:t xml:space="preserve">Privacy rule: </w:t>
+      </w:r>
+      <w:r>
+        <w:t>prefer coarse bands, aggregation and suppression over exact tenant values; never expose named competitors, raw records or sparse cells that permit reverse engineering.</w:t>
+      </w:r>
+    </w:p>
+    <w:p>
+      <w:pPr>
+        <w:pStyle w:val="Heading2"/>
+      </w:pPr>
+      <w:r>
+        <w:t>Model Independence and Fine-Tuning</w:t>
+      </w:r>
+    </w:p>
+    <w:p>
+      <w:pPr/>
+      <w:r>
+        <w:t>A Somtico-owned fine-tuned or distilled model may become useful later, but the model itself is not the moat. The durable asset is the proprietary corpus and evaluation system: validated metrics, recommendation/outcome pairs, failure cases, owner acceptance/rejection, forecast-versus-actual history, mappings and industry definitions. Use the best eligible provider while the proprietary intelligence layer compounds; fine-tune only when data volume, quality and economics justify it.</w:t>
+      </w:r>
+    </w:p>
+    <w:p>
+      <w:pPr>
+        <w:pStyle w:val="Heading2"/>
+      </w:pPr>
+      <w:r>
+        <w:t>Moat Compounding Gates</w:t>
+      </w:r>
+    </w:p>
+    <w:p>
+      <w:pPr>
+        <w:pStyle w:val="ListBullet"/>
+      </w:pPr>
+      <w:r>
+        <w:rPr>
+          <w:b/>
+        </w:rPr>
+        <w:t xml:space="preserve">Before scaling the design-partner cohort: </w:t>
+      </w:r>
+      <w:r>
+        <w:t>the structured recommendation lifecycle and context snapshot schema exist so early decisions are not lost as unstructured chat history.</w:t>
+      </w:r>
+    </w:p>
+    <w:p>
+      <w:pPr>
+        <w:pStyle w:val="ListBullet"/>
+      </w:pPr>
+      <w:r>
+        <w:rPr>
+          <w:b/>
+        </w:rPr>
+        <w:t xml:space="preserve">Before publishing peer playbooks: </w:t>
+      </w:r>
+      <w:r>
+        <w:t>there are enough comparable opted-in outcome records to satisfy privacy and statistical-support thresholds, and helped-rate calculations include context rather than only global popularity.</w:t>
+      </w:r>
+    </w:p>
+    <w:p>
+      <w:pPr>
+        <w:pStyle w:val="ListBullet"/>
+      </w:pPr>
+      <w:r>
+        <w:rPr>
+          <w:b/>
+        </w:rPr>
+        <w:t xml:space="preserve">Before publishing benchmarks: </w:t>
+      </w:r>
+      <w:r>
+        <w:t>metric definitions reconcile across tenants, cohort-size/suppression rules pass, and users can see freshness, cohort definition and confidence.</w:t>
+      </w:r>
+    </w:p>
+    <w:p>
+      <w:pPr>
+        <w:pStyle w:val="ListBullet"/>
+      </w:pPr>
+      <w:r>
+        <w:rPr>
+          <w:b/>
+        </w:rPr>
+        <w:t xml:space="preserve">Before claiming an AI moat: </w:t>
+      </w:r>
+      <w:r>
+        <w:t>the evaluation harness demonstrates that Chuk plus Somtico intelligence outperforms a generic frontier-model baseline on representative factuality, evidence, actionability and hallucination criteria.</w:t>
+      </w:r>
+    </w:p>
+    <w:p>
+      <w:pPr>
+        <w:pStyle w:val="ListBullet"/>
+      </w:pPr>
+      <w:r>
+        <w:rPr>
+          <w:b/>
+        </w:rPr>
+        <w:t xml:space="preserve">Before fine-tuning a proprietary model: </w:t>
+      </w:r>
+      <w:r>
+        <w:t>the dataset is large, permissioned, versioned and high-quality enough that model training is likely to outperform routing to a frontier provider or reduce cost materially.</w:t>
+      </w:r>
+    </w:p>
+    <w:p>
+      <w:pPr>
+        <w:pStyle w:val="ListBullet"/>
+      </w:pPr>
+      <w:r>
+        <w:rPr>
+          <w:b/>
+        </w:rPr>
+        <w:t xml:space="preserve">Before entering a second vertical: </w:t>
+      </w:r>
+      <w:r>
+        <w:t>the education flywheel is demonstrably compounding: onboarding is faster, mappings are reused, recommendations are increasingly informed by proprietary evidence and peer intelligence is valuable enough to improve retention or willingness to pay.</w:t>
+      </w:r>
+    </w:p>
+    <w:p>
+      <w:pPr>
         <w:pStyle w:val="Heading1"/>
       </w:pPr>
       <w:r>
@@ -15017,6 +15894,46 @@
     </w:p>
     <w:p>
       <w:pPr>
+        <w:pStyle w:val="ListBullet"/>
+      </w:pPr>
+      <w:r>
+        <w:t>Structured decision-outcome event store with versioned context snapshots</w:t>
+      </w:r>
+    </w:p>
+    <w:p>
+      <w:pPr>
+        <w:pStyle w:val="ListBullet"/>
+      </w:pPr>
+      <w:r>
+        <w:t>Intervention, diagnosis and outcome taxonomies for contextual learning</w:t>
+      </w:r>
+    </w:p>
+    <w:p>
+      <w:pPr>
+        <w:pStyle w:val="ListBullet"/>
+      </w:pPr>
+      <w:r>
+        <w:t>Source-schema fingerprinting and reviewed mapping-knowledge library</w:t>
+      </w:r>
+    </w:p>
+    <w:p>
+      <w:pPr>
+        <w:pStyle w:val="ListBullet"/>
+      </w:pPr>
+      <w:r>
+        <w:t>Benchmark-ready privacy-safe metric snapshot pipeline</w:t>
+      </w:r>
+    </w:p>
+    <w:p>
+      <w:pPr>
+        <w:pStyle w:val="ListBullet"/>
+      </w:pPr>
+      <w:r>
+        <w:t>Generic-model baseline and proprietary-intelligence evaluation harness</w:t>
+      </w:r>
+    </w:p>
+    <w:p>
+      <w:pPr>
         <w:pStyle w:val="Heading2"/>
       </w:pPr>
       <w:r>
@@ -15415,6 +16332,38 @@
     </w:p>
     <w:p>
       <w:pPr>
+        <w:pStyle w:val="ListBullet"/>
+      </w:pPr>
+      <w:r>
+        <w:t>Do not treat a fine-tuned model as the moat; protect and improve the proprietary data, definitions, outcome history, evaluation assets and workflows that make any model more useful.</w:t>
+      </w:r>
+    </w:p>
+    <w:p>
+      <w:pPr>
+        <w:pStyle w:val="ListBullet"/>
+      </w:pPr>
+      <w:r>
+        <w:t>Do not let general model knowledge override deterministic tenant metrics, verified source data or validated proprietary playbooks when those sources are available.</w:t>
+      </w:r>
+    </w:p>
+    <w:p>
+      <w:pPr>
+        <w:pStyle w:val="ListBullet"/>
+      </w:pPr>
+      <w:r>
+        <w:t>Do not publish cross-tenant outcome rankings or benchmarks simply because data has been collected; require explicit consent, comparable definitions, minimum cohort sizes and privacy suppression first.</w:t>
+      </w:r>
+    </w:p>
+    <w:p>
+      <w:pPr>
+        <w:pStyle w:val="ListBullet"/>
+      </w:pPr>
+      <w:r>
+        <w:t>Do not store raw tenant conversations as the default cross-tenant learning corpus. Convert eligible learning signals into reviewed structured records with purpose/versioned consent and minimum necessary context.</w:t>
+      </w:r>
+    </w:p>
+    <w:p>
+      <w:pPr>
         <w:pStyle w:val="Heading1"/>
       </w:pPr>
       <w:r>
@@ -15567,6 +16516,110 @@
       </w:pPr>
       <w:r>
         <w:t>Benchmark cohort coverage and suppression rate by industry/geography.</w:t>
+      </w:r>
+    </w:p>
+    <w:p>
+      <w:pPr>
+        <w:pStyle w:val="Heading2"/>
+      </w:pPr>
+      <w:r>
+        <w:t>Moat Health Metrics</w:t>
+      </w:r>
+    </w:p>
+    <w:p>
+      <w:pPr>
+        <w:pStyle w:val="ListBullet"/>
+      </w:pPr>
+      <w:r>
+        <w:t>Number of validated decision-outcome observations, split by measured, owner-confirmed, no-effect/hurt and unknown/pending outcomes.</w:t>
+      </w:r>
+    </w:p>
+    <w:p>
+      <w:pPr>
+        <w:pStyle w:val="ListBullet"/>
+      </w:pPr>
+      <w:r>
+        <w:t>Percentage of eligible recommendations with a complete versioned context -&gt; diagnosis -&gt; intervention -&gt; decision -&gt; outcome record.</w:t>
+      </w:r>
+    </w:p>
+    <w:p>
+      <w:pPr>
+        <w:pStyle w:val="ListBullet"/>
+      </w:pPr>
+      <w:r>
+        <w:t>Percentage of advisor recommendations materially grounded in Somtico deterministic tools, tenant history or validated proprietary playbooks rather than general model knowledge alone.</w:t>
+      </w:r>
+    </w:p>
+    <w:p>
+      <w:pPr>
+        <w:pStyle w:val="ListBullet"/>
+      </w:pPr>
+      <w:r>
+        <w:t>Recommendation success and no-effect/hurt rates by playbook, diagnosis and comparable context cohort, with minimum-sample disclosure.</w:t>
+      </w:r>
+    </w:p>
+    <w:p>
+      <w:pPr>
+        <w:pStyle w:val="ListBullet"/>
+      </w:pPr>
+      <w:r>
+        <w:t>Number of benchmark-ready opted-in organizations and percentage of candidate cohorts that meet privacy-safe minimum sizes.</w:t>
+      </w:r>
+    </w:p>
+    <w:p>
+      <w:pPr>
+        <w:pStyle w:val="ListBullet"/>
+      </w:pPr>
+      <w:r>
+        <w:t>Benchmark metric reconciliation rate: percentage of cross-tenant metric snapshots computed from the same approved definition/version.</w:t>
+      </w:r>
+    </w:p>
+    <w:p>
+      <w:pPr>
+        <w:pStyle w:val="ListBullet"/>
+      </w:pPr>
+      <w:r>
+        <w:t>Source-mapping reuse rate, mapping-suggestion acceptance rate, correction rate and median manual mapping steps per new organization.</w:t>
+      </w:r>
+    </w:p>
+    <w:p>
+      <w:pPr>
+        <w:pStyle w:val="ListBullet"/>
+      </w:pPr>
+      <w:r>
+        <w:t>Median onboarding time by source system and whether it decreases as mapping intelligence accumulates.</w:t>
+      </w:r>
+    </w:p>
+    <w:p>
+      <w:pPr>
+        <w:pStyle w:val="ListBullet"/>
+      </w:pPr>
+      <w:r>
+        <w:t>Forecast error improvement over time by metric/horizon while preserving a simple baseline model for comparison.</w:t>
+      </w:r>
+    </w:p>
+    <w:p>
+      <w:pPr>
+        <w:pStyle w:val="ListBullet"/>
+      </w:pPr>
+      <w:r>
+        <w:t>Chuk-versus-generic-model evaluation score on a fixed representative test set covering factuality, evidence grounding, actionability, missing-data discipline and hallucination rate.</w:t>
+      </w:r>
+    </w:p>
+    <w:p>
+      <w:pPr>
+        <w:pStyle w:val="ListBullet"/>
+      </w:pPr>
+      <w:r>
+        <w:t>Percentage of recurring owner questions for which Chuk can answer from proprietary structured intelligence without relying on unrestricted general model knowledge.</w:t>
+      </w:r>
+    </w:p>
+    <w:p>
+      <w:pPr>
+        <w:pStyle w:val="ListBullet"/>
+      </w:pPr>
+      <w:r>
+        <w:t>Customer ROI attributable to verified recommendations and whether higher use of proprietary intelligence correlates with retention, referrals or willingness to pay.</w:t>
       </w:r>
     </w:p>
     <w:p>
@@ -16687,6 +17740,90 @@
     </w:p>
     <w:p>
       <w:pPr>
+        <w:pStyle w:val="Heading2"/>
+      </w:pPr>
+      <w:r>
+        <w:t>Planned Moat Upgrade: Context-Rich Outcome Records (Not Yet Shipped)</w:t>
+      </w:r>
+    </w:p>
+    <w:p>
+      <w:pPr/>
+      <w:r>
+        <w:t>The current anonymized_tactic_outcomes implementation is a useful first step, but future privacy-safe learning should capture enough coarse context to answer "what tends to work under conditions like these?" rather than only "what helped most often overall?" This is roadmap direction, not a claim about current production code.</w:t>
+      </w:r>
+    </w:p>
+    <w:p>
+      <w:pPr>
+        <w:pStyle w:val="ListBullet"/>
+      </w:pPr>
+      <w:r>
+        <w:rPr>
+          <w:b/>
+        </w:rPr>
+        <w:t xml:space="preserve">Context fields should be coarse and minimal: </w:t>
+      </w:r>
+      <w:r>
+        <w:t>education subtype, programme category, active-enrolment band, location-count band, utilization band, conversion/retention health, spare-capacity state, cash-safety band, season/period and the diagnosed leak where relevant.</w:t>
+      </w:r>
+    </w:p>
+    <w:p>
+      <w:pPr>
+        <w:pStyle w:val="ListBullet"/>
+      </w:pPr>
+      <w:r>
+        <w:rPr>
+          <w:b/>
+        </w:rPr>
+        <w:t xml:space="preserve">Intervention fields: </w:t>
+      </w:r>
+      <w:r>
+        <w:t>tactic category, estimated effort/cost band, intended mechanism and decision horizon; no tenant free text in the cross-tenant learning record.</w:t>
+      </w:r>
+    </w:p>
+    <w:p>
+      <w:pPr>
+        <w:pStyle w:val="ListBullet"/>
+      </w:pPr>
+      <w:r>
+        <w:rPr>
+          <w:b/>
+        </w:rPr>
+        <w:t xml:space="preserve">Outcome fields: </w:t>
+      </w:r>
+      <w:r>
+        <w:t>HELPED, NO_EFFECT, HURT or UNKNOWN plus measurement horizon and verification type where available.</w:t>
+      </w:r>
+    </w:p>
+    <w:p>
+      <w:pPr>
+        <w:pStyle w:val="ListBullet"/>
+      </w:pPr>
+      <w:r>
+        <w:rPr>
+          <w:b/>
+        </w:rPr>
+        <w:t xml:space="preserve">Privacy controls: </w:t>
+      </w:r>
+      <w:r>
+        <w:t>explicit opt-in, purpose/versioned consent, no organization ID in the learning row, no student/customer data, no raw chat, suppression of rare context combinations and deletion/withdrawal handling appropriate to the chosen architecture.</w:t>
+      </w:r>
+    </w:p>
+    <w:p>
+      <w:pPr>
+        <w:pStyle w:val="ListBullet"/>
+      </w:pPr>
+      <w:r>
+        <w:rPr>
+          <w:b/>
+        </w:rPr>
+        <w:t xml:space="preserve">Ranking rule: </w:t>
+      </w:r>
+      <w:r>
+        <w:t>only use contextual peer ranking when enough comparable opted-in records exist; otherwise fall back to transparent deterministic playbooks and clearly label insufficient peer evidence.</w:t>
+      </w:r>
+    </w:p>
+    <w:p>
+      <w:pPr>
         <w:pStyle w:val="Heading1"/>
       </w:pPr>
       <w:r>
@@ -16996,6 +18133,14 @@
     </w:p>
     <w:p>
       <w:pPr>
+        <w:pStyle w:val="ListBullet"/>
+      </w:pPr>
+      <w:r>
+        <w:t>Expanded cross-tenant moat infrastructure beyond the currently shipped anonymized tactic-outcome counts — including context-rich decision-outcome records, benchmark-ready metric snapshots, reusable source-schema mapping intelligence and the generic-model baseline evaluation harness.</w:t>
+      </w:r>
+    </w:p>
+    <w:p>
+      <w:pPr>
         <w:pStyle w:val="Heading2"/>
       </w:pPr>
       <w:r>
@@ -17037,6 +18182,9 @@
     <w:p>
       <w:r>
         <w:t>Start with a market small enough to understand deeply and a product small enough to finish. The long-term North Star remains a multi-industry AI business operating system, but the launch product is AI Business Advisor — with Chuk as the advisor persona — for independent after-school, tutoring and enrichment centres. STEM Lantern is Customer #1; the next customers should look more like STEM Lantern, not less. Architectural foresight is valuable only when it prevents a costly dead end. It must not become an excuse to build future industries, connectors or abstractions before the first niche receives repeatable, measurable value. The product earns each expansion: first solve one owner's problem, then a handful of similar owners, then a focused market, then adjacent markets. The platform should therefore feel specialized in experience and disciplined in scope while remaining extensible underneath. Dominate depth before pursuing breadth.</w:t>
+      </w:r>
+      <w:r>
+        <w:t xml:space="preserve"> Treat frontier AI models as replaceable infrastructure: the compounding asset should be Somtico-owned business data, metric definitions, decision-outcome evidence, mapping intelligence, validated playbooks, evaluation history and privacy-safe peer intelligence.</w:t>
       </w:r>
     </w:p>
     <w:sectPr>
@@ -17933,7 +19081,7 @@
     <w:rPr>
       <w:rFonts w:asciiTheme="majorHAnsi" w:eastAsiaTheme="majorEastAsia" w:hAnsiTheme="majorHAnsi" w:cstheme="majorBidi"/>
       <w:color w:val="4F81BD" w:themeColor="accent1"/>
-      <w:sz w:val="20"/>
+      <w:sz w:val="24"/>
       <w:szCs w:val="20"/>
     </w:rPr>
   </w:style>
@@ -17958,7 +19106,7 @@
       <w:i/>
       <w:iCs/>
       <w:color w:val="404040" w:themeColor="text1" w:themeTint="BF"/>
-      <w:sz w:val="20"/>
+      <w:sz w:val="24"/>
       <w:szCs w:val="20"/>
     </w:rPr>
   </w:style>
@@ -18214,7 +19362,7 @@
     <w:unhideWhenUsed/>
     <w:rsid w:val="00AA1D8D"/>
     <w:rPr>
-      <w:sz w:val="16"/>
+      <w:sz w:val="24"/>
       <w:szCs w:val="16"/>
     </w:rPr>
   </w:style>
@@ -18225,7 +19373,7 @@
     <w:uiPriority w:val="99"/>
     <w:rsid w:val="00AA1D8D"/>
     <w:rPr>
-      <w:sz w:val="16"/>
+      <w:sz w:val="24"/>
       <w:szCs w:val="16"/>
     </w:rPr>
   </w:style>
@@ -18392,7 +19540,7 @@
     </w:pPr>
     <w:rPr>
       <w:rFonts w:ascii="Courier" w:hAnsi="Courier"/>
-      <w:sz w:val="20"/>
+      <w:sz w:val="24"/>
       <w:szCs w:val="20"/>
     </w:rPr>
   </w:style>
@@ -18404,7 +19552,7 @@
     <w:rsid w:val="0029639D"/>
     <w:rPr>
       <w:rFonts w:ascii="Courier" w:hAnsi="Courier"/>
-      <w:sz w:val="20"/>
+      <w:sz w:val="24"/>
       <w:szCs w:val="20"/>
     </w:rPr>
   </w:style>
@@ -18500,7 +19648,7 @@
     <w:rPr>
       <w:rFonts w:asciiTheme="majorHAnsi" w:eastAsiaTheme="majorEastAsia" w:hAnsiTheme="majorHAnsi" w:cstheme="majorBidi"/>
       <w:color w:val="4F81BD" w:themeColor="accent1"/>
-      <w:sz w:val="20"/>
+      <w:sz w:val="24"/>
       <w:szCs w:val="20"/>
     </w:rPr>
   </w:style>
@@ -18516,7 +19664,7 @@
       <w:i/>
       <w:iCs/>
       <w:color w:val="404040" w:themeColor="text1" w:themeTint="BF"/>
-      <w:sz w:val="20"/>
+      <w:sz w:val="24"/>
       <w:szCs w:val="20"/>
     </w:rPr>
   </w:style>
@@ -18536,7 +19684,7 @@
       <w:b/>
       <w:bCs/>
       <w:color w:val="4F81BD" w:themeColor="accent1"/>
-      <w:sz w:val="18"/>
+      <w:sz w:val="24"/>
       <w:szCs w:val="18"/>
     </w:rPr>
   </w:style>

</xml_diff>

<commit_message>
Align vision docx with Somtico Business Advisor branding
Update product name, Advisor identity, and remove Chuk persona
language so the roadmap doc matches the shipped product.
</commit_message>
<xml_diff>
--- a/AI_Business_Intelligence_SaaS_Product_Vision_and_Roadmap_Beachhead_Strategy.docx
+++ b/AI_Business_Intelligence_SaaS_Product_Vision_and_Roadmap_Beachhead_Strategy.docx
@@ -50,7 +50,7 @@
           <w:color w:val="2D7D7A"/>
           <w:sz w:val="28"/>
         </w:rPr>
-        <w:t>Working Product Name: AI Business Advisor (AI advisor persona: Chuk)</w:t>
+        <w:t>Working Product Name: Somtico Business Advisor (AI within the product: Advisor — no character name)</w:t>
       </w:r>
     </w:p>
     <w:p>
@@ -75,7 +75,7 @@
     </w:p>
     <w:p>
       <w:r>
-        <w:t>Revision: Beachhead-Market Strategy, After-School-First Commercial Focus, Industry-Aware Future Architecture, Privacy-First AI Learning and Benchmarking, Proprietary Intelligence Flywheel, Contextual Decision-Outcome Learning, Benchmark-Ready Data Collection, Mapping Intelligence, Moat Health Metrics, Shipped Beachhead Product Reality (Chuk, Pricing Advisor, Enrolment Advisor, Impact Ledger, Claude-first routing, legal/landing/R2)</w:t>
+        <w:t>Revision: Beachhead-Market Strategy, After-School-First Commercial Focus, Industry-Aware Future Architecture, Privacy-First AI Learning and Benchmarking, Proprietary Intelligence Flywheel, Contextual Decision-Outcome Learning, Benchmark-Ready Data Collection, Mapping Intelligence, Moat Health Metrics, Shipped Beachhead Product Reality (Somtico Business Advisor / Advisor, Pricing Advisor, Enrolment Advisor, Impact Ledger, Claude-first routing, legal/landing/R2)</w:t>
       </w:r>
     </w:p>
     <w:p>
@@ -294,7 +294,7 @@
         <w:spacing w:after="40"/>
       </w:pPr>
       <w:r>
-        <w:t>20. AI Business Advisor</w:t>
+        <w:t>20. Somtico Business Advisor</w:t>
       </w:r>
     </w:p>
     <w:p>
@@ -8086,12 +8086,12 @@
         <w:pStyle w:val="Heading1"/>
       </w:pPr>
       <w:r>
-        <w:t>20. AI Business Advisor</w:t>
-      </w:r>
-    </w:p>
-    <w:p>
-      <w:r>
-        <w:t>The AI Advisor (user-facing name: Chuk) is a base product capability, not an optional add-on. Every paying plan should include conversational access and automatic insight generation. Higher plans can include more usage, deeper reasoning, more frequent analysis and advanced tools. In the shipped product, Chuk calls deterministic analytics tools only; it does not invent metrics.</w:t>
+        <w:t>20. Somtico Business Advisor</w:t>
+      </w:r>
+    </w:p>
+    <w:p>
+      <w:r>
+        <w:t>Advisor is a base product capability, not an optional add-on. Every paying plan should include conversational access and automatic insight generation. Higher plans can include more usage, deeper reasoning, more frequent analysis and advanced tools. In the shipped product, Advisor calls deterministic analytics tools only; it does not invent metrics. Advisor has no personal or character name.</w:t>
       </w:r>
     </w:p>
     <w:p>
@@ -8260,11 +8260,9 @@
         <w:rPr>
           <w:b/>
         </w:rPr>
-        <w:t xml:space="preserve">Evaluation rule: </w:t>
-      </w:r>
-      <w:r>
-        <w:t>maintain a generic-model baseline so the full Chuk system can be tested against the same frontier model using only a generic education-business prompt. If Chuk is not increasingly more accurate, actionable and evidence-grounded, the moat is not strengthening.</w:t>
-      </w:r>
+        <w:t>Evaluation rule: maintain a generic-model baseline so the full Somtico Advisor system can be tested against the same frontier model using only a generic education-business prompt. If Advisor is not increasingly more accurate, actionable and evidence-grounded, the moat is not strengthening.</w:t>
+      </w:r>
+      <w:r/>
     </w:p>
     <w:p>
       <w:pPr>
@@ -13997,11 +13995,9 @@
         <w:rPr>
           <w:b/>
         </w:rPr>
-        <w:t xml:space="preserve">Baseline differentiation: </w:t>
-      </w:r>
-      <w:r>
-        <w:t>a repeatable evaluation harness shows the complete Chuk system is materially more factual, evidence-grounded or actionable than the same frontier model given only a generic after-school-business prompt on representative owner questions.</w:t>
-      </w:r>
+        <w:t>Baseline differentiation: a repeatable evaluation harness shows the complete Somtico Advisor system is materially more factual, evidence-grounded or actionable than the same frontier model given only a generic after-school-business prompt on representative owner questions.</w:t>
+      </w:r>
+      <w:r/>
     </w:p>
     <w:p>
       <w:pPr>
@@ -14405,7 +14401,7 @@
           </w:tcPr>
           <w:p>
             <w:r>
-              <w:t>What the centre tried, what Chuk recommended, what was accepted/rejected and what happened afterwards</w:t>
+              <w:t>What the centre tried, what Advisor recommended, what was accepted/rejected and what happened afterwards</w:t>
             </w:r>
           </w:p>
         </w:tc>
@@ -14900,11 +14896,9 @@
         <w:rPr>
           <w:b/>
         </w:rPr>
-        <w:t xml:space="preserve">Before claiming an AI moat: </w:t>
-      </w:r>
-      <w:r>
-        <w:t>the evaluation harness demonstrates that Chuk plus Somtico intelligence outperforms a generic frontier-model baseline on representative factuality, evidence, actionability and hallucination criteria.</w:t>
-      </w:r>
+        <w:t>Before claiming an AI moat: the evaluation harness demonstrates that Advisor plus Somtico intelligence outperforms a generic frontier-model baseline on representative factuality, evidence, actionability and hallucination criteria.</w:t>
+      </w:r>
+      <w:r/>
     </w:p>
     <w:p>
       <w:pPr>
@@ -16603,15 +16597,15 @@
         <w:pStyle w:val="ListBullet"/>
       </w:pPr>
       <w:r>
-        <w:t>Chuk-versus-generic-model evaluation score on a fixed representative test set covering factuality, evidence grounding, actionability, missing-data discipline and hallucination rate.</w:t>
-      </w:r>
-    </w:p>
-    <w:p>
-      <w:pPr>
-        <w:pStyle w:val="ListBullet"/>
-      </w:pPr>
-      <w:r>
-        <w:t>Percentage of recurring owner questions for which Chuk can answer from proprietary structured intelligence without relying on unrestricted general model knowledge.</w:t>
+        <w:t>Advisor-versus-generic-model evaluation score on a fixed representative test set covering factuality, evidence grounding, actionability, missing-data discipline and hallucination rate.</w:t>
+      </w:r>
+    </w:p>
+    <w:p>
+      <w:pPr>
+        <w:pStyle w:val="ListBullet"/>
+      </w:pPr>
+      <w:r>
+        <w:t>Percentage of recurring owner questions for which Advisor can answer from proprietary structured intelligence without relying on unrestricted general model knowledge.</w:t>
       </w:r>
     </w:p>
     <w:p>
@@ -17623,7 +17617,7 @@
     </w:p>
     <w:p>
       <w:r>
-        <w:t>Two specialized advisors shipped inside Phase 1 / early Phase 2 depth. Both are deterministic services; Chuk only phrases their evidence. They feed the Action Centre and the impact ledger.</w:t>
+        <w:t>Two specialized advisors shipped inside Phase 1 / early Phase 2 depth. Both are deterministic services; Advisor only phrases their evidence. They feed the Action Centre and the impact ledger.</w:t>
       </w:r>
     </w:p>
     <w:p>
@@ -17679,7 +17673,7 @@
         <w:pStyle w:val="ListBullet"/>
       </w:pPr>
       <w:r>
-        <w:t>Surfaces: /app/pricing, GET /api/app/pricing/guidance, pricingGuidance AI tool, insight-run recommendations, inline weekly-session form (POST /api/app/sessions). Session evidence returned to the UI strips per-instructor hourly rates and burden percents; Chuk still sees full evidence server-side.</w:t>
+        <w:t>Surfaces: /app/pricing, GET /api/app/pricing/guidance, pricingGuidance AI tool, insight-run recommendations, inline weekly-session form (POST /api/app/sessions). Session evidence returned to the UI strips per-instructor hourly rates and burden percents; Advisor still sees full evidence server-side.</w:t>
       </w:r>
     </w:p>
     <w:p>
@@ -17735,7 +17729,7 @@
         <w:pStyle w:val="ListBullet"/>
       </w:pPr>
       <w:r>
-        <w:t>Surfaces: /app/enrolment, GET /api/app/enrolment/guidance, tactic POST/DELETE, enrolmentGuidance AI tool, insight-run recommendations. Ask Chuk must ask for tried-and-results when that log is empty and must not invent student counts or ROI.</w:t>
+        <w:t>Surfaces: /app/enrolment, GET /api/app/enrolment/guidance, tactic POST/DELETE, enrolmentGuidance AI tool, insight-run recommendations. Ask Advisor must ask for tried-and-results when that log is empty and must not invent student counts or ROI.</w:t>
       </w:r>
     </w:p>
     <w:p>
@@ -17832,7 +17826,7 @@
     </w:p>
     <w:p>
       <w:r>
-        <w:t>This section captures how the live AI Business Advisor product works in the business-advisor codebase. Long-term vision sections above remain intentional direction; they are not a claim that every listed capability is already built. Where this section and an earlier aspirational paragraph conflict, this section and BUSINESS_ADVISOR_PROJECT_SPECIFICATION.md win for shipped behaviour.</w:t>
+        <w:t>This section captures how the live Somtico Business Advisor product works in the business-advisor codebase. Long-term vision sections above remain intentional direction; they are not a claim that every listed capability is already built. Where this section and an earlier aspirational paragraph conflict, this section and BUSINESS_ADVISOR_PROJECT_SPECIFICATION.md win for shipped behaviour.</w:t>
       </w:r>
     </w:p>
     <w:p>
@@ -17848,7 +17842,7 @@
         <w:pStyle w:val="ListBullet"/>
       </w:pPr>
       <w:r>
-        <w:t>Product name: AI Business Advisor. AI advisor persona: Chuk (software, not a person). Company: Somtico Technologies Inc.</w:t>
+        <w:t>Product name: Somtico Business Advisor (shorter: Business Advisor). AI within the product: Advisor (software, not a person; no character name). Company: Somtico Technologies Inc.</w:t>
       </w:r>
     </w:p>
     <w:p>
@@ -17888,7 +17882,7 @@
         <w:pStyle w:val="ListBullet"/>
       </w:pPr>
       <w:r>
-        <w:t>AI: keyword tool routing → deterministic analytics tools → Claude preferred → OpenAI fallback → local deterministic fallback. Conversations stored; usage metered. Ask Chuk UI does not expose provider/model names.</w:t>
+        <w:t>AI: keyword tool routing → deterministic analytics tools → Claude preferred → OpenAI fallback → local deterministic fallback. Conversations stored; usage metered. Ask Advisor UI does not expose provider/model names.</w:t>
       </w:r>
     </w:p>
     <w:p>
@@ -17960,7 +17954,7 @@
         <w:pStyle w:val="ListBullet"/>
       </w:pPr>
       <w:r>
-        <w:t>Command Centre (/app): metrics, this week's named leak / cheap next step / last tactic / playbook counts / open actions (operating loop), Chuk's Impact card, forecasts, staffing-vs-demand.</w:t>
+        <w:t>Command Centre (/app): metrics, this week's named leak / cheap next step / last tactic / playbook counts / open actions (operating loop), Advisor's Impact card, forecasts, staffing-vs-demand.</w:t>
       </w:r>
     </w:p>
     <w:p>
@@ -17984,15 +17978,15 @@
         <w:pStyle w:val="ListBullet"/>
       </w:pPr>
       <w:r>
-        <w:t>Pricing Advisor; Enrolment Advisor; Ask Chuk; Help &amp; FAQ; Settings (billing, Connect, portal sync, weekly brief triggers).</w:t>
-      </w:r>
-    </w:p>
-    <w:p>
-      <w:pPr>
-        <w:pStyle w:val="ListBullet"/>
-      </w:pPr>
-      <w:r>
-        <w:t>Public marketing landing at / with Meet Chuk, how-it-works, capabilities, product screenshots, visitor FAQs, Start Pilot / Sign In. Public chrome also wraps login, signup, terms, privacy, verify-email.</w:t>
+        <w:t>Pricing Advisor; Enrolment Advisor; Ask Advisor; Help &amp; FAQ; Settings (billing, Connect, portal sync, weekly brief triggers).</w:t>
+      </w:r>
+    </w:p>
+    <w:p>
+      <w:pPr>
+        <w:pStyle w:val="ListBullet"/>
+      </w:pPr>
+      <w:r>
+        <w:t>Public marketing landing at / with Meet Your Advisor, how-it-works, capabilities, product screenshots, visitor FAQs, Start Pilot / Sign In. Public chrome also wraps login, signup, terms, privacy, verify-email.</w:t>
       </w:r>
     </w:p>
     <w:p>
@@ -18056,7 +18050,7 @@
         <w:pStyle w:val="ListBullet"/>
       </w:pPr>
       <w:r>
-        <w:t>Organization memory tool: every Ask Chuk call includes this centre's last 90 days of actions, verified impact, and enrolment tactics. Chuk must not recommend repeating a tactic whose recorded outcome here was NO_EFFECT or HURT unless the owner asks.</w:t>
+        <w:t>Organization memory tool: every Ask Advisor call includes this centre's last 90 days of actions, verified impact, and enrolment tactics. Advisor must not recommend repeating a tactic whose recorded outcome here was NO_EFFECT or HURT unless the owner asks.</w:t>
       </w:r>
     </w:p>
     <w:p>
@@ -18080,7 +18074,7 @@
         <w:pStyle w:val="ListBullet"/>
       </w:pPr>
       <w:r>
-        <w:t>AnalysisProgress + SkeletonCard loading UX on Pricing Advisor, Ask Chuk, Command Centre, and Action Centre insight runs.</w:t>
+        <w:t>AnalysisProgress + SkeletonCard loading UX on Pricing Advisor, Ask Advisor, Command Centre, and Action Centre insight runs.</w:t>
       </w:r>
     </w:p>
     <w:p>
@@ -18181,11 +18175,9 @@
     </w:p>
     <w:p>
       <w:r>
-        <w:t>Start with a market small enough to understand deeply and a product small enough to finish. The long-term North Star remains a multi-industry AI business operating system, but the launch product is AI Business Advisor — with Chuk as the advisor persona — for independent after-school, tutoring and enrichment centres. STEM Lantern is Customer #1; the next customers should look more like STEM Lantern, not less. Architectural foresight is valuable only when it prevents a costly dead end. It must not become an excuse to build future industries, connectors or abstractions before the first niche receives repeatable, measurable value. The product earns each expansion: first solve one owner's problem, then a handful of similar owners, then a focused market, then adjacent markets. The platform should therefore feel specialized in experience and disciplined in scope while remaining extensible underneath. Dominate depth before pursuing breadth.</w:t>
-      </w:r>
-      <w:r>
-        <w:t xml:space="preserve"> Treat frontier AI models as replaceable infrastructure: the compounding asset should be Somtico-owned business data, metric definitions, decision-outcome evidence, mapping intelligence, validated playbooks, evaluation history and privacy-safe peer intelligence.</w:t>
-      </w:r>
+        <w:t>Start with a market small enough to understand deeply and a product small enough to finish. The long-term North Star remains a multi-industry AI business operating system, but the launch product is Somtico Business Advisor — with Advisor as the AI capability (no character name) — for independent after-school, tutoring and enrichment centres. STEM Lantern is Customer #1; the next customers should look more like STEM Lantern, not less. Architectural foresight is valuable only when it prevents a costly dead end. It must not become an excuse to build future industries, connectors or abstractions before the first niche receives repeatable, measurable value. The product earns each expansion: first solve one owner's problem, then a handful of similar owners, then a focused market, then adjacent markets. The platform should therefore feel specialized in experience and disciplined in scope while remaining extensible underneath. Dominate depth before pursuing breadth. Treat frontier AI models as replaceable infrastructure: the compounding asset should be Somtico-owned business data, metric definitions, decision-outcome evidence, mapping intelligence, validated playbooks, evaluation history and privacy-safe peer intelligence.</w:t>
+      </w:r>
+      <w:r/>
     </w:p>
     <w:sectPr>
       <w:headerReference w:type="default" r:id="rId8"/>

</xml_diff>